<commit_message>
docs: re-render ISO doc set in branded house-style (cover/TOC/header-footer/tables)
- new md2docx_pro renderer: World Fert brand (navy #0C447C/#1F3864, Prompt font),
  cover page + doc-control table, auto TOC, running header/footer (page X/Y +
  Confidential), branded + zebra tables
- re-rendered all docs/word/*.docx (12 files) consistently

Co-Authored-By: Claude Opus 4.8 <noreply@anthropic.com>
</commit_message>
<xml_diff>
--- a/docs/word/03-USER-GUIDE.docx
+++ b/docs/word/03-USER-GUIDE.docx
@@ -4,61 +4,74 @@
   <w:body>
     <w:p>
       <w:pPr>
-        <w:pStyle w:val="Heading1"/>
-      </w:pPr>
-      <w:r>
-        <w:rPr>
-          <w:rFonts w:ascii="Prompt" w:cs="Prompt" w:eastAsia="Prompt" w:hAnsi="Prompt"/>
+        <w:spacing w:after="0" w:before="1800"/>
+        <w:jc w:val="center"/>
+      </w:pPr>
+      <w:r>
+        <w:rPr>
+          <w:rFonts w:ascii="Prompt" w:cs="Prompt" w:eastAsia="Prompt" w:hAnsi="Prompt"/>
+          <w:b/>
+          <w:bCs/>
+          <w:color w:val="0C447C"/>
+          <w:sz w:val="28"/>
+          <w:szCs w:val="28"/>
+        </w:rPr>
+        <w:t xml:space="preserve">WS-Sale-App</w:t>
+      </w:r>
+    </w:p>
+    <w:p>
+      <w:pPr>
+        <w:spacing w:after="0"/>
+        <w:jc w:val="center"/>
+      </w:pPr>
+      <w:r>
+        <w:rPr>
+          <w:rFonts w:ascii="Prompt" w:cs="Prompt" w:eastAsia="Prompt" w:hAnsi="Prompt"/>
+          <w:color w:val="BA7517"/>
+          <w:sz w:val="20"/>
+          <w:szCs w:val="20"/>
+        </w:rPr>
+        <w:t xml:space="preserve">World Fert Co., Ltd.</w:t>
+      </w:r>
+    </w:p>
+    <w:p>
+      <w:pPr>
+        <w:pBdr>
+          <w:bottom w:val="single" w:color="1F3864" w:sz="18" w:space="6"/>
+        </w:pBdr>
+        <w:spacing w:after="120" w:before="240"/>
+        <w:jc w:val="center"/>
+      </w:pPr>
+      <w:r>
+        <w:rPr>
+          <w:rFonts w:ascii="Prompt" w:cs="Prompt" w:eastAsia="Prompt" w:hAnsi="Prompt"/>
+          <w:b/>
+          <w:bCs/>
+          <w:color w:val="1F3864"/>
+          <w:sz w:val="40"/>
+          <w:szCs w:val="40"/>
         </w:rPr>
         <w:t xml:space="preserve">03 — คู่มือผู้ใช้งาน (User Guide &amp; Manual)</w:t>
       </w:r>
     </w:p>
     <w:p>
       <w:pPr>
-        <w:pBdr>
-          <w:left w:val="single" w:color="2E75B6" w:sz="12" w:space="8"/>
-        </w:pBdr>
-        <w:spacing w:after="60"/>
-        <w:ind w:left="360"/>
-      </w:pPr>
-      <w:r>
-        <w:rPr>
-          <w:rFonts w:ascii="Prompt" w:cs="Prompt" w:eastAsia="Prompt" w:hAnsi="Prompt"/>
-          <w:color w:val="444444"/>
-        </w:rPr>
-        <w:t xml:space="preserve">WS-Sale-App · build v4.2.17 · สำหรับผู้ใช้ทุก Role</w:t>
-      </w:r>
-    </w:p>
-    <w:p>
-      <w:pPr>
-        <w:pBdr>
-          <w:left w:val="single" w:color="2E75B6" w:sz="12" w:space="8"/>
-        </w:pBdr>
-        <w:spacing w:after="60"/>
-        <w:ind w:left="360"/>
-      </w:pPr>
-      <w:r>
-        <w:rPr>
-          <w:rFonts w:ascii="Prompt" w:cs="Prompt" w:eastAsia="Prompt" w:hAnsi="Prompt"/>
-          <w:color w:val="444444"/>
-        </w:rPr>
-        <w:t xml:space="preserve">ระบบเป็น Web App (tablet-first, iPad 768–1024px) · เข้าผ่าน browser</w:t>
-      </w:r>
-    </w:p>
-    <w:p>
-      <w:pPr>
-        <w:pStyle w:val="Heading2"/>
-      </w:pPr>
-      <w:r>
-        <w:rPr>
-          <w:rFonts w:ascii="Prompt" w:cs="Prompt" w:eastAsia="Prompt" w:hAnsi="Prompt"/>
-        </w:rPr>
-        <w:t xml:space="preserve">บทบาทผู้ใช้ (Roles)</w:t>
+        <w:spacing w:after="600" w:before="120"/>
+        <w:jc w:val="center"/>
+      </w:pPr>
+      <w:r>
+        <w:rPr>
+          <w:rFonts w:ascii="Prompt" w:cs="Prompt" w:eastAsia="Prompt" w:hAnsi="Prompt"/>
+          <w:color w:val="8A8A8A"/>
+          <w:sz w:val="18"/>
+          <w:szCs w:val="18"/>
+        </w:rPr>
+        <w:t xml:space="preserve">Enterprise Production Documentation · Confidential</w:t>
       </w:r>
     </w:p>
     <w:tbl>
       <w:tblPr>
-        <w:tblW w:type="dxa" w:w="9360"/>
+        <w:tblW w:type="dxa" w:w="9468"/>
         <w:tblBorders>
           <w:top w:val="single" w:color="auto" w:sz="4"/>
           <w:left w:val="single" w:color="auto" w:sz="4"/>
@@ -69,9 +82,9 @@
         </w:tblBorders>
       </w:tblPr>
       <w:tblGrid>
-        <w:gridCol w:w="3120"/>
-        <w:gridCol w:w="3120"/>
-        <w:gridCol w:w="3120"/>
+        <w:gridCol w:w="3156"/>
+        <w:gridCol w:w="3156"/>
+        <w:gridCol w:w="3156"/>
       </w:tblGrid>
       <w:tr>
         <w:trPr>
@@ -79,7 +92,7 @@
         </w:trPr>
         <w:tc>
           <w:tcPr>
-            <w:tcW w:type="dxa" w:w="3120"/>
+            <w:tcW w:type="dxa" w:w="3156"/>
             <w:tcBorders>
               <w:top w:val="single" w:color="C9D3E0" w:sz="1"/>
               <w:left w:val="single" w:color="C9D3E0" w:sz="1"/>
@@ -89,12 +102,16 @@
             <w:shd w:fill="1F3864" w:val="clear"/>
             <w:tcMar>
               <w:top w:type="dxa" w:w="40"/>
-              <w:left w:type="dxa" w:w="80"/>
+              <w:left w:type="dxa" w:w="90"/>
               <w:bottom w:type="dxa" w:w="40"/>
-              <w:right w:type="dxa" w:w="80"/>
+              <w:right w:type="dxa" w:w="90"/>
             </w:tcMar>
+            <w:vAlign w:val="center"/>
           </w:tcPr>
           <w:p>
+            <w:pPr>
+              <w:spacing w:after="0" w:line="252"/>
+            </w:pPr>
             <w:r>
               <w:rPr>
                 <w:rFonts w:ascii="Prompt" w:cs="Prompt" w:eastAsia="Prompt" w:hAnsi="Prompt"/>
@@ -110,7 +127,7 @@
         </w:tc>
         <w:tc>
           <w:tcPr>
-            <w:tcW w:type="dxa" w:w="3120"/>
+            <w:tcW w:type="dxa" w:w="3156"/>
             <w:tcBorders>
               <w:top w:val="single" w:color="C9D3E0" w:sz="1"/>
               <w:left w:val="single" w:color="C9D3E0" w:sz="1"/>
@@ -120,12 +137,16 @@
             <w:shd w:fill="1F3864" w:val="clear"/>
             <w:tcMar>
               <w:top w:type="dxa" w:w="40"/>
-              <w:left w:type="dxa" w:w="80"/>
+              <w:left w:type="dxa" w:w="90"/>
               <w:bottom w:type="dxa" w:w="40"/>
-              <w:right w:type="dxa" w:w="80"/>
+              <w:right w:type="dxa" w:w="90"/>
             </w:tcMar>
+            <w:vAlign w:val="center"/>
           </w:tcPr>
           <w:p>
+            <w:pPr>
+              <w:spacing w:after="0" w:line="252"/>
+            </w:pPr>
             <w:r>
               <w:rPr>
                 <w:rFonts w:ascii="Prompt" w:cs="Prompt" w:eastAsia="Prompt" w:hAnsi="Prompt"/>
@@ -141,7 +162,7 @@
         </w:tc>
         <w:tc>
           <w:tcPr>
-            <w:tcW w:type="dxa" w:w="3120"/>
+            <w:tcW w:type="dxa" w:w="3156"/>
             <w:tcBorders>
               <w:top w:val="single" w:color="C9D3E0" w:sz="1"/>
               <w:left w:val="single" w:color="C9D3E0" w:sz="1"/>
@@ -151,12 +172,16 @@
             <w:shd w:fill="1F3864" w:val="clear"/>
             <w:tcMar>
               <w:top w:type="dxa" w:w="40"/>
-              <w:left w:type="dxa" w:w="80"/>
+              <w:left w:type="dxa" w:w="90"/>
               <w:bottom w:type="dxa" w:w="40"/>
-              <w:right w:type="dxa" w:w="80"/>
+              <w:right w:type="dxa" w:w="90"/>
             </w:tcMar>
+            <w:vAlign w:val="center"/>
           </w:tcPr>
           <w:p>
+            <w:pPr>
+              <w:spacing w:after="0" w:line="252"/>
+            </w:pPr>
             <w:r>
               <w:rPr>
                 <w:rFonts w:ascii="Prompt" w:cs="Prompt" w:eastAsia="Prompt" w:hAnsi="Prompt"/>
@@ -174,7 +199,7 @@
       <w:tr>
         <w:tc>
           <w:tcPr>
-            <w:tcW w:type="dxa" w:w="3120"/>
+            <w:tcW w:type="dxa" w:w="3156"/>
             <w:tcBorders>
               <w:top w:val="single" w:color="C9D3E0" w:sz="1"/>
               <w:left w:val="single" w:color="C9D3E0" w:sz="1"/>
@@ -184,17 +209,22 @@
             <w:shd w:fill="FFFFFF" w:val="clear"/>
             <w:tcMar>
               <w:top w:type="dxa" w:w="40"/>
-              <w:left w:type="dxa" w:w="80"/>
+              <w:left w:type="dxa" w:w="90"/>
               <w:bottom w:type="dxa" w:w="40"/>
-              <w:right w:type="dxa" w:w="80"/>
+              <w:right w:type="dxa" w:w="90"/>
             </w:tcMar>
+            <w:vAlign w:val="center"/>
           </w:tcPr>
           <w:p>
+            <w:pPr>
+              <w:spacing w:after="0" w:line="252"/>
+            </w:pPr>
             <w:r>
               <w:rPr>
                 <w:rFonts w:ascii="Prompt" w:cs="Prompt" w:eastAsia="Prompt" w:hAnsi="Prompt"/>
                 <w:b/>
                 <w:bCs/>
+                <w:color w:val="1A1A1A"/>
                 <w:sz w:val="18"/>
                 <w:szCs w:val="18"/>
               </w:rPr>
@@ -204,7 +234,7 @@
         </w:tc>
         <w:tc>
           <w:tcPr>
-            <w:tcW w:type="dxa" w:w="3120"/>
+            <w:tcW w:type="dxa" w:w="3156"/>
             <w:tcBorders>
               <w:top w:val="single" w:color="C9D3E0" w:sz="1"/>
               <w:left w:val="single" w:color="C9D3E0" w:sz="1"/>
@@ -214,15 +244,20 @@
             <w:shd w:fill="FFFFFF" w:val="clear"/>
             <w:tcMar>
               <w:top w:type="dxa" w:w="40"/>
-              <w:left w:type="dxa" w:w="80"/>
+              <w:left w:type="dxa" w:w="90"/>
               <w:bottom w:type="dxa" w:w="40"/>
-              <w:right w:type="dxa" w:w="80"/>
+              <w:right w:type="dxa" w:w="90"/>
             </w:tcMar>
+            <w:vAlign w:val="center"/>
           </w:tcPr>
           <w:p>
+            <w:pPr>
+              <w:spacing w:after="0" w:line="252"/>
+            </w:pPr>
             <w:r>
               <w:rPr>
                 <w:rFonts w:ascii="Prompt" w:cs="Prompt" w:eastAsia="Prompt" w:hAnsi="Prompt"/>
+                <w:color w:val="1A1A1A"/>
                 <w:sz w:val="18"/>
                 <w:szCs w:val="18"/>
               </w:rPr>
@@ -232,7 +267,7 @@
         </w:tc>
         <w:tc>
           <w:tcPr>
-            <w:tcW w:type="dxa" w:w="3120"/>
+            <w:tcW w:type="dxa" w:w="3156"/>
             <w:tcBorders>
               <w:top w:val="single" w:color="C9D3E0" w:sz="1"/>
               <w:left w:val="single" w:color="C9D3E0" w:sz="1"/>
@@ -242,15 +277,20 @@
             <w:shd w:fill="FFFFFF" w:val="clear"/>
             <w:tcMar>
               <w:top w:type="dxa" w:w="40"/>
-              <w:left w:type="dxa" w:w="80"/>
+              <w:left w:type="dxa" w:w="90"/>
               <w:bottom w:type="dxa" w:w="40"/>
-              <w:right w:type="dxa" w:w="80"/>
+              <w:right w:type="dxa" w:w="90"/>
             </w:tcMar>
+            <w:vAlign w:val="center"/>
           </w:tcPr>
           <w:p>
+            <w:pPr>
+              <w:spacing w:after="0" w:line="252"/>
+            </w:pPr>
             <w:r>
               <w:rPr>
                 <w:rFonts w:ascii="Prompt" w:cs="Prompt" w:eastAsia="Prompt" w:hAnsi="Prompt"/>
+                <w:color w:val="1A1A1A"/>
                 <w:sz w:val="18"/>
                 <w:szCs w:val="18"/>
               </w:rPr>
@@ -262,27 +302,32 @@
       <w:tr>
         <w:tc>
           <w:tcPr>
-            <w:tcW w:type="dxa" w:w="3120"/>
+            <w:tcW w:type="dxa" w:w="3156"/>
             <w:tcBorders>
               <w:top w:val="single" w:color="C9D3E0" w:sz="1"/>
               <w:left w:val="single" w:color="C9D3E0" w:sz="1"/>
               <w:bottom w:val="single" w:color="C9D3E0" w:sz="1"/>
               <w:right w:val="single" w:color="C9D3E0" w:sz="1"/>
             </w:tcBorders>
-            <w:shd w:fill="FFFFFF" w:val="clear"/>
+            <w:shd w:fill="F4F6FA" w:val="clear"/>
             <w:tcMar>
               <w:top w:type="dxa" w:w="40"/>
-              <w:left w:type="dxa" w:w="80"/>
+              <w:left w:type="dxa" w:w="90"/>
               <w:bottom w:type="dxa" w:w="40"/>
-              <w:right w:type="dxa" w:w="80"/>
+              <w:right w:type="dxa" w:w="90"/>
             </w:tcMar>
+            <w:vAlign w:val="center"/>
           </w:tcPr>
           <w:p>
+            <w:pPr>
+              <w:spacing w:after="0" w:line="252"/>
+            </w:pPr>
             <w:r>
               <w:rPr>
                 <w:rFonts w:ascii="Prompt" w:cs="Prompt" w:eastAsia="Prompt" w:hAnsi="Prompt"/>
                 <w:b/>
                 <w:bCs/>
+                <w:color w:val="1A1A1A"/>
                 <w:sz w:val="18"/>
                 <w:szCs w:val="18"/>
               </w:rPr>
@@ -292,25 +337,30 @@
         </w:tc>
         <w:tc>
           <w:tcPr>
-            <w:tcW w:type="dxa" w:w="3120"/>
+            <w:tcW w:type="dxa" w:w="3156"/>
             <w:tcBorders>
               <w:top w:val="single" w:color="C9D3E0" w:sz="1"/>
               <w:left w:val="single" w:color="C9D3E0" w:sz="1"/>
               <w:bottom w:val="single" w:color="C9D3E0" w:sz="1"/>
               <w:right w:val="single" w:color="C9D3E0" w:sz="1"/>
             </w:tcBorders>
-            <w:shd w:fill="FFFFFF" w:val="clear"/>
+            <w:shd w:fill="F4F6FA" w:val="clear"/>
             <w:tcMar>
               <w:top w:type="dxa" w:w="40"/>
-              <w:left w:type="dxa" w:w="80"/>
+              <w:left w:type="dxa" w:w="90"/>
               <w:bottom w:type="dxa" w:w="40"/>
-              <w:right w:type="dxa" w:w="80"/>
+              <w:right w:type="dxa" w:w="90"/>
             </w:tcMar>
+            <w:vAlign w:val="center"/>
           </w:tcPr>
           <w:p>
+            <w:pPr>
+              <w:spacing w:after="0" w:line="252"/>
+            </w:pPr>
             <w:r>
               <w:rPr>
                 <w:rFonts w:ascii="Prompt" w:cs="Prompt" w:eastAsia="Prompt" w:hAnsi="Prompt"/>
+                <w:color w:val="1A1A1A"/>
                 <w:sz w:val="18"/>
                 <w:szCs w:val="18"/>
               </w:rPr>
@@ -320,25 +370,30 @@
         </w:tc>
         <w:tc>
           <w:tcPr>
-            <w:tcW w:type="dxa" w:w="3120"/>
+            <w:tcW w:type="dxa" w:w="3156"/>
             <w:tcBorders>
               <w:top w:val="single" w:color="C9D3E0" w:sz="1"/>
               <w:left w:val="single" w:color="C9D3E0" w:sz="1"/>
               <w:bottom w:val="single" w:color="C9D3E0" w:sz="1"/>
               <w:right w:val="single" w:color="C9D3E0" w:sz="1"/>
             </w:tcBorders>
-            <w:shd w:fill="FFFFFF" w:val="clear"/>
+            <w:shd w:fill="F4F6FA" w:val="clear"/>
             <w:tcMar>
               <w:top w:type="dxa" w:w="40"/>
-              <w:left w:type="dxa" w:w="80"/>
+              <w:left w:type="dxa" w:w="90"/>
               <w:bottom w:type="dxa" w:w="40"/>
-              <w:right w:type="dxa" w:w="80"/>
+              <w:right w:type="dxa" w:w="90"/>
             </w:tcMar>
+            <w:vAlign w:val="center"/>
           </w:tcPr>
           <w:p>
+            <w:pPr>
+              <w:spacing w:after="0" w:line="252"/>
+            </w:pPr>
             <w:r>
               <w:rPr>
                 <w:rFonts w:ascii="Prompt" w:cs="Prompt" w:eastAsia="Prompt" w:hAnsi="Prompt"/>
+                <w:color w:val="1A1A1A"/>
                 <w:sz w:val="18"/>
                 <w:szCs w:val="18"/>
               </w:rPr>
@@ -350,7 +405,7 @@
       <w:tr>
         <w:tc>
           <w:tcPr>
-            <w:tcW w:type="dxa" w:w="3120"/>
+            <w:tcW w:type="dxa" w:w="3156"/>
             <w:tcBorders>
               <w:top w:val="single" w:color="C9D3E0" w:sz="1"/>
               <w:left w:val="single" w:color="C9D3E0" w:sz="1"/>
@@ -360,17 +415,22 @@
             <w:shd w:fill="FFFFFF" w:val="clear"/>
             <w:tcMar>
               <w:top w:type="dxa" w:w="40"/>
-              <w:left w:type="dxa" w:w="80"/>
+              <w:left w:type="dxa" w:w="90"/>
               <w:bottom w:type="dxa" w:w="40"/>
-              <w:right w:type="dxa" w:w="80"/>
+              <w:right w:type="dxa" w:w="90"/>
             </w:tcMar>
+            <w:vAlign w:val="center"/>
           </w:tcPr>
           <w:p>
+            <w:pPr>
+              <w:spacing w:after="0" w:line="252"/>
+            </w:pPr>
             <w:r>
               <w:rPr>
                 <w:rFonts w:ascii="Prompt" w:cs="Prompt" w:eastAsia="Prompt" w:hAnsi="Prompt"/>
                 <w:b/>
                 <w:bCs/>
+                <w:color w:val="1A1A1A"/>
                 <w:sz w:val="18"/>
                 <w:szCs w:val="18"/>
               </w:rPr>
@@ -380,7 +440,7 @@
         </w:tc>
         <w:tc>
           <w:tcPr>
-            <w:tcW w:type="dxa" w:w="3120"/>
+            <w:tcW w:type="dxa" w:w="3156"/>
             <w:tcBorders>
               <w:top w:val="single" w:color="C9D3E0" w:sz="1"/>
               <w:left w:val="single" w:color="C9D3E0" w:sz="1"/>
@@ -390,15 +450,20 @@
             <w:shd w:fill="FFFFFF" w:val="clear"/>
             <w:tcMar>
               <w:top w:type="dxa" w:w="40"/>
-              <w:left w:type="dxa" w:w="80"/>
+              <w:left w:type="dxa" w:w="90"/>
               <w:bottom w:type="dxa" w:w="40"/>
-              <w:right w:type="dxa" w:w="80"/>
+              <w:right w:type="dxa" w:w="90"/>
             </w:tcMar>
+            <w:vAlign w:val="center"/>
           </w:tcPr>
           <w:p>
+            <w:pPr>
+              <w:spacing w:after="0" w:line="252"/>
+            </w:pPr>
             <w:r>
               <w:rPr>
                 <w:rFonts w:ascii="Prompt" w:cs="Prompt" w:eastAsia="Prompt" w:hAnsi="Prompt"/>
+                <w:color w:val="1A1A1A"/>
                 <w:sz w:val="18"/>
                 <w:szCs w:val="18"/>
               </w:rPr>
@@ -408,7 +473,7 @@
         </w:tc>
         <w:tc>
           <w:tcPr>
-            <w:tcW w:type="dxa" w:w="3120"/>
+            <w:tcW w:type="dxa" w:w="3156"/>
             <w:tcBorders>
               <w:top w:val="single" w:color="C9D3E0" w:sz="1"/>
               <w:left w:val="single" w:color="C9D3E0" w:sz="1"/>
@@ -418,15 +483,20 @@
             <w:shd w:fill="FFFFFF" w:val="clear"/>
             <w:tcMar>
               <w:top w:type="dxa" w:w="40"/>
-              <w:left w:type="dxa" w:w="80"/>
+              <w:left w:type="dxa" w:w="90"/>
               <w:bottom w:type="dxa" w:w="40"/>
-              <w:right w:type="dxa" w:w="80"/>
+              <w:right w:type="dxa" w:w="90"/>
             </w:tcMar>
+            <w:vAlign w:val="center"/>
           </w:tcPr>
           <w:p>
+            <w:pPr>
+              <w:spacing w:after="0" w:line="252"/>
+            </w:pPr>
             <w:r>
               <w:rPr>
                 <w:rFonts w:ascii="Prompt" w:cs="Prompt" w:eastAsia="Prompt" w:hAnsi="Prompt"/>
+                <w:color w:val="1A1A1A"/>
                 <w:sz w:val="18"/>
                 <w:szCs w:val="18"/>
               </w:rPr>
@@ -438,27 +508,32 @@
       <w:tr>
         <w:tc>
           <w:tcPr>
-            <w:tcW w:type="dxa" w:w="3120"/>
+            <w:tcW w:type="dxa" w:w="3156"/>
             <w:tcBorders>
               <w:top w:val="single" w:color="C9D3E0" w:sz="1"/>
               <w:left w:val="single" w:color="C9D3E0" w:sz="1"/>
               <w:bottom w:val="single" w:color="C9D3E0" w:sz="1"/>
               <w:right w:val="single" w:color="C9D3E0" w:sz="1"/>
             </w:tcBorders>
-            <w:shd w:fill="FFFFFF" w:val="clear"/>
+            <w:shd w:fill="F4F6FA" w:val="clear"/>
             <w:tcMar>
               <w:top w:type="dxa" w:w="40"/>
-              <w:left w:type="dxa" w:w="80"/>
+              <w:left w:type="dxa" w:w="90"/>
               <w:bottom w:type="dxa" w:w="40"/>
-              <w:right w:type="dxa" w:w="80"/>
+              <w:right w:type="dxa" w:w="90"/>
             </w:tcMar>
+            <w:vAlign w:val="center"/>
           </w:tcPr>
           <w:p>
+            <w:pPr>
+              <w:spacing w:after="0" w:line="252"/>
+            </w:pPr>
             <w:r>
               <w:rPr>
                 <w:rFonts w:ascii="Prompt" w:cs="Prompt" w:eastAsia="Prompt" w:hAnsi="Prompt"/>
                 <w:b/>
                 <w:bCs/>
+                <w:color w:val="1A1A1A"/>
                 <w:sz w:val="18"/>
                 <w:szCs w:val="18"/>
               </w:rPr>
@@ -468,25 +543,30 @@
         </w:tc>
         <w:tc>
           <w:tcPr>
-            <w:tcW w:type="dxa" w:w="3120"/>
+            <w:tcW w:type="dxa" w:w="3156"/>
             <w:tcBorders>
               <w:top w:val="single" w:color="C9D3E0" w:sz="1"/>
               <w:left w:val="single" w:color="C9D3E0" w:sz="1"/>
               <w:bottom w:val="single" w:color="C9D3E0" w:sz="1"/>
               <w:right w:val="single" w:color="C9D3E0" w:sz="1"/>
             </w:tcBorders>
-            <w:shd w:fill="FFFFFF" w:val="clear"/>
+            <w:shd w:fill="F4F6FA" w:val="clear"/>
             <w:tcMar>
               <w:top w:type="dxa" w:w="40"/>
-              <w:left w:type="dxa" w:w="80"/>
+              <w:left w:type="dxa" w:w="90"/>
               <w:bottom w:type="dxa" w:w="40"/>
-              <w:right w:type="dxa" w:w="80"/>
+              <w:right w:type="dxa" w:w="90"/>
             </w:tcMar>
+            <w:vAlign w:val="center"/>
           </w:tcPr>
           <w:p>
+            <w:pPr>
+              <w:spacing w:after="0" w:line="252"/>
+            </w:pPr>
             <w:r>
               <w:rPr>
                 <w:rFonts w:ascii="Prompt" w:cs="Prompt" w:eastAsia="Prompt" w:hAnsi="Prompt"/>
+                <w:color w:val="1A1A1A"/>
                 <w:sz w:val="18"/>
                 <w:szCs w:val="18"/>
               </w:rPr>
@@ -496,25 +576,30 @@
         </w:tc>
         <w:tc>
           <w:tcPr>
-            <w:tcW w:type="dxa" w:w="3120"/>
+            <w:tcW w:type="dxa" w:w="3156"/>
             <w:tcBorders>
               <w:top w:val="single" w:color="C9D3E0" w:sz="1"/>
               <w:left w:val="single" w:color="C9D3E0" w:sz="1"/>
               <w:bottom w:val="single" w:color="C9D3E0" w:sz="1"/>
               <w:right w:val="single" w:color="C9D3E0" w:sz="1"/>
             </w:tcBorders>
-            <w:shd w:fill="FFFFFF" w:val="clear"/>
+            <w:shd w:fill="F4F6FA" w:val="clear"/>
             <w:tcMar>
               <w:top w:type="dxa" w:w="40"/>
-              <w:left w:type="dxa" w:w="80"/>
+              <w:left w:type="dxa" w:w="90"/>
               <w:bottom w:type="dxa" w:w="40"/>
-              <w:right w:type="dxa" w:w="80"/>
+              <w:right w:type="dxa" w:w="90"/>
             </w:tcMar>
+            <w:vAlign w:val="center"/>
           </w:tcPr>
           <w:p>
+            <w:pPr>
+              <w:spacing w:after="0" w:line="252"/>
+            </w:pPr>
             <w:r>
               <w:rPr>
                 <w:rFonts w:ascii="Prompt" w:cs="Prompt" w:eastAsia="Prompt" w:hAnsi="Prompt"/>
+                <w:color w:val="1A1A1A"/>
                 <w:sz w:val="18"/>
                 <w:szCs w:val="18"/>
               </w:rPr>
@@ -526,7 +611,7 @@
       <w:tr>
         <w:tc>
           <w:tcPr>
-            <w:tcW w:type="dxa" w:w="3120"/>
+            <w:tcW w:type="dxa" w:w="3156"/>
             <w:tcBorders>
               <w:top w:val="single" w:color="C9D3E0" w:sz="1"/>
               <w:left w:val="single" w:color="C9D3E0" w:sz="1"/>
@@ -536,17 +621,22 @@
             <w:shd w:fill="FFFFFF" w:val="clear"/>
             <w:tcMar>
               <w:top w:type="dxa" w:w="40"/>
-              <w:left w:type="dxa" w:w="80"/>
+              <w:left w:type="dxa" w:w="90"/>
               <w:bottom w:type="dxa" w:w="40"/>
-              <w:right w:type="dxa" w:w="80"/>
+              <w:right w:type="dxa" w:w="90"/>
             </w:tcMar>
+            <w:vAlign w:val="center"/>
           </w:tcPr>
           <w:p>
+            <w:pPr>
+              <w:spacing w:after="0" w:line="252"/>
+            </w:pPr>
             <w:r>
               <w:rPr>
                 <w:rFonts w:ascii="Prompt" w:cs="Prompt" w:eastAsia="Prompt" w:hAnsi="Prompt"/>
                 <w:b/>
                 <w:bCs/>
+                <w:color w:val="1A1A1A"/>
                 <w:sz w:val="18"/>
                 <w:szCs w:val="18"/>
               </w:rPr>
@@ -556,7 +646,7 @@
         </w:tc>
         <w:tc>
           <w:tcPr>
-            <w:tcW w:type="dxa" w:w="3120"/>
+            <w:tcW w:type="dxa" w:w="3156"/>
             <w:tcBorders>
               <w:top w:val="single" w:color="C9D3E0" w:sz="1"/>
               <w:left w:val="single" w:color="C9D3E0" w:sz="1"/>
@@ -566,15 +656,20 @@
             <w:shd w:fill="FFFFFF" w:val="clear"/>
             <w:tcMar>
               <w:top w:type="dxa" w:w="40"/>
-              <w:left w:type="dxa" w:w="80"/>
+              <w:left w:type="dxa" w:w="90"/>
               <w:bottom w:type="dxa" w:w="40"/>
-              <w:right w:type="dxa" w:w="80"/>
+              <w:right w:type="dxa" w:w="90"/>
             </w:tcMar>
+            <w:vAlign w:val="center"/>
           </w:tcPr>
           <w:p>
+            <w:pPr>
+              <w:spacing w:after="0" w:line="252"/>
+            </w:pPr>
             <w:r>
               <w:rPr>
                 <w:rFonts w:ascii="Prompt" w:cs="Prompt" w:eastAsia="Prompt" w:hAnsi="Prompt"/>
+                <w:color w:val="1A1A1A"/>
                 <w:sz w:val="18"/>
                 <w:szCs w:val="18"/>
               </w:rPr>
@@ -584,7 +679,7 @@
         </w:tc>
         <w:tc>
           <w:tcPr>
-            <w:tcW w:type="dxa" w:w="3120"/>
+            <w:tcW w:type="dxa" w:w="3156"/>
             <w:tcBorders>
               <w:top w:val="single" w:color="C9D3E0" w:sz="1"/>
               <w:left w:val="single" w:color="C9D3E0" w:sz="1"/>
@@ -594,15 +689,20 @@
             <w:shd w:fill="FFFFFF" w:val="clear"/>
             <w:tcMar>
               <w:top w:type="dxa" w:w="40"/>
-              <w:left w:type="dxa" w:w="80"/>
+              <w:left w:type="dxa" w:w="90"/>
               <w:bottom w:type="dxa" w:w="40"/>
-              <w:right w:type="dxa" w:w="80"/>
+              <w:right w:type="dxa" w:w="90"/>
             </w:tcMar>
+            <w:vAlign w:val="center"/>
           </w:tcPr>
           <w:p>
+            <w:pPr>
+              <w:spacing w:after="0" w:line="252"/>
+            </w:pPr>
             <w:r>
               <w:rPr>
                 <w:rFonts w:ascii="Prompt" w:cs="Prompt" w:eastAsia="Prompt" w:hAnsi="Prompt"/>
+                <w:color w:val="1A1A1A"/>
                 <w:sz w:val="18"/>
                 <w:szCs w:val="18"/>
               </w:rPr>
@@ -614,27 +714,32 @@
       <w:tr>
         <w:tc>
           <w:tcPr>
-            <w:tcW w:type="dxa" w:w="3120"/>
+            <w:tcW w:type="dxa" w:w="3156"/>
             <w:tcBorders>
               <w:top w:val="single" w:color="C9D3E0" w:sz="1"/>
               <w:left w:val="single" w:color="C9D3E0" w:sz="1"/>
               <w:bottom w:val="single" w:color="C9D3E0" w:sz="1"/>
               <w:right w:val="single" w:color="C9D3E0" w:sz="1"/>
             </w:tcBorders>
-            <w:shd w:fill="FFFFFF" w:val="clear"/>
+            <w:shd w:fill="F4F6FA" w:val="clear"/>
             <w:tcMar>
               <w:top w:type="dxa" w:w="40"/>
-              <w:left w:type="dxa" w:w="80"/>
+              <w:left w:type="dxa" w:w="90"/>
               <w:bottom w:type="dxa" w:w="40"/>
-              <w:right w:type="dxa" w:w="80"/>
+              <w:right w:type="dxa" w:w="90"/>
             </w:tcMar>
+            <w:vAlign w:val="center"/>
           </w:tcPr>
           <w:p>
+            <w:pPr>
+              <w:spacing w:after="0" w:line="252"/>
+            </w:pPr>
             <w:r>
               <w:rPr>
                 <w:rFonts w:ascii="Prompt" w:cs="Prompt" w:eastAsia="Prompt" w:hAnsi="Prompt"/>
                 <w:b/>
                 <w:bCs/>
+                <w:color w:val="1A1A1A"/>
                 <w:sz w:val="18"/>
                 <w:szCs w:val="18"/>
               </w:rPr>
@@ -644,25 +749,30 @@
         </w:tc>
         <w:tc>
           <w:tcPr>
-            <w:tcW w:type="dxa" w:w="3120"/>
+            <w:tcW w:type="dxa" w:w="3156"/>
             <w:tcBorders>
               <w:top w:val="single" w:color="C9D3E0" w:sz="1"/>
               <w:left w:val="single" w:color="C9D3E0" w:sz="1"/>
               <w:bottom w:val="single" w:color="C9D3E0" w:sz="1"/>
               <w:right w:val="single" w:color="C9D3E0" w:sz="1"/>
             </w:tcBorders>
-            <w:shd w:fill="FFFFFF" w:val="clear"/>
+            <w:shd w:fill="F4F6FA" w:val="clear"/>
             <w:tcMar>
               <w:top w:type="dxa" w:w="40"/>
-              <w:left w:type="dxa" w:w="80"/>
+              <w:left w:type="dxa" w:w="90"/>
               <w:bottom w:type="dxa" w:w="40"/>
-              <w:right w:type="dxa" w:w="80"/>
+              <w:right w:type="dxa" w:w="90"/>
             </w:tcMar>
+            <w:vAlign w:val="center"/>
           </w:tcPr>
           <w:p>
+            <w:pPr>
+              <w:spacing w:after="0" w:line="252"/>
+            </w:pPr>
             <w:r>
               <w:rPr>
                 <w:rFonts w:ascii="Prompt" w:cs="Prompt" w:eastAsia="Prompt" w:hAnsi="Prompt"/>
+                <w:color w:val="1A1A1A"/>
                 <w:sz w:val="18"/>
                 <w:szCs w:val="18"/>
               </w:rPr>
@@ -672,25 +782,30 @@
         </w:tc>
         <w:tc>
           <w:tcPr>
-            <w:tcW w:type="dxa" w:w="3120"/>
+            <w:tcW w:type="dxa" w:w="3156"/>
             <w:tcBorders>
               <w:top w:val="single" w:color="C9D3E0" w:sz="1"/>
               <w:left w:val="single" w:color="C9D3E0" w:sz="1"/>
               <w:bottom w:val="single" w:color="C9D3E0" w:sz="1"/>
               <w:right w:val="single" w:color="C9D3E0" w:sz="1"/>
             </w:tcBorders>
-            <w:shd w:fill="FFFFFF" w:val="clear"/>
+            <w:shd w:fill="F4F6FA" w:val="clear"/>
             <w:tcMar>
               <w:top w:type="dxa" w:w="40"/>
-              <w:left w:type="dxa" w:w="80"/>
+              <w:left w:type="dxa" w:w="90"/>
               <w:bottom w:type="dxa" w:w="40"/>
-              <w:right w:type="dxa" w:w="80"/>
+              <w:right w:type="dxa" w:w="90"/>
             </w:tcMar>
+            <w:vAlign w:val="center"/>
           </w:tcPr>
           <w:p>
+            <w:pPr>
+              <w:spacing w:after="0" w:line="252"/>
+            </w:pPr>
             <w:r>
               <w:rPr>
                 <w:rFonts w:ascii="Prompt" w:cs="Prompt" w:eastAsia="Prompt" w:hAnsi="Prompt"/>
+                <w:color w:val="1A1A1A"/>
                 <w:sz w:val="18"/>
                 <w:szCs w:val="18"/>
               </w:rPr>
@@ -702,7 +817,7 @@
       <w:tr>
         <w:tc>
           <w:tcPr>
-            <w:tcW w:type="dxa" w:w="3120"/>
+            <w:tcW w:type="dxa" w:w="3156"/>
             <w:tcBorders>
               <w:top w:val="single" w:color="C9D3E0" w:sz="1"/>
               <w:left w:val="single" w:color="C9D3E0" w:sz="1"/>
@@ -712,17 +827,22 @@
             <w:shd w:fill="FFFFFF" w:val="clear"/>
             <w:tcMar>
               <w:top w:type="dxa" w:w="40"/>
-              <w:left w:type="dxa" w:w="80"/>
+              <w:left w:type="dxa" w:w="90"/>
               <w:bottom w:type="dxa" w:w="40"/>
-              <w:right w:type="dxa" w:w="80"/>
+              <w:right w:type="dxa" w:w="90"/>
             </w:tcMar>
+            <w:vAlign w:val="center"/>
           </w:tcPr>
           <w:p>
+            <w:pPr>
+              <w:spacing w:after="0" w:line="252"/>
+            </w:pPr>
             <w:r>
               <w:rPr>
                 <w:rFonts w:ascii="Prompt" w:cs="Prompt" w:eastAsia="Prompt" w:hAnsi="Prompt"/>
                 <w:b/>
                 <w:bCs/>
+                <w:color w:val="1A1A1A"/>
                 <w:sz w:val="18"/>
                 <w:szCs w:val="18"/>
               </w:rPr>
@@ -732,7 +852,7 @@
         </w:tc>
         <w:tc>
           <w:tcPr>
-            <w:tcW w:type="dxa" w:w="3120"/>
+            <w:tcW w:type="dxa" w:w="3156"/>
             <w:tcBorders>
               <w:top w:val="single" w:color="C9D3E0" w:sz="1"/>
               <w:left w:val="single" w:color="C9D3E0" w:sz="1"/>
@@ -742,15 +862,20 @@
             <w:shd w:fill="FFFFFF" w:val="clear"/>
             <w:tcMar>
               <w:top w:type="dxa" w:w="40"/>
-              <w:left w:type="dxa" w:w="80"/>
+              <w:left w:type="dxa" w:w="90"/>
               <w:bottom w:type="dxa" w:w="40"/>
-              <w:right w:type="dxa" w:w="80"/>
+              <w:right w:type="dxa" w:w="90"/>
             </w:tcMar>
+            <w:vAlign w:val="center"/>
           </w:tcPr>
           <w:p>
+            <w:pPr>
+              <w:spacing w:after="0" w:line="252"/>
+            </w:pPr>
             <w:r>
               <w:rPr>
                 <w:rFonts w:ascii="Prompt" w:cs="Prompt" w:eastAsia="Prompt" w:hAnsi="Prompt"/>
+                <w:color w:val="1A1A1A"/>
                 <w:sz w:val="18"/>
                 <w:szCs w:val="18"/>
               </w:rPr>
@@ -760,7 +885,7 @@
         </w:tc>
         <w:tc>
           <w:tcPr>
-            <w:tcW w:type="dxa" w:w="3120"/>
+            <w:tcW w:type="dxa" w:w="3156"/>
             <w:tcBorders>
               <w:top w:val="single" w:color="C9D3E0" w:sz="1"/>
               <w:left w:val="single" w:color="C9D3E0" w:sz="1"/>
@@ -770,15 +895,20 @@
             <w:shd w:fill="FFFFFF" w:val="clear"/>
             <w:tcMar>
               <w:top w:type="dxa" w:w="40"/>
-              <w:left w:type="dxa" w:w="80"/>
+              <w:left w:type="dxa" w:w="90"/>
               <w:bottom w:type="dxa" w:w="40"/>
-              <w:right w:type="dxa" w:w="80"/>
+              <w:right w:type="dxa" w:w="90"/>
             </w:tcMar>
+            <w:vAlign w:val="center"/>
           </w:tcPr>
           <w:p>
+            <w:pPr>
+              <w:spacing w:after="0" w:line="252"/>
+            </w:pPr>
             <w:r>
               <w:rPr>
                 <w:rFonts w:ascii="Prompt" w:cs="Prompt" w:eastAsia="Prompt" w:hAnsi="Prompt"/>
+                <w:color w:val="1A1A1A"/>
                 <w:sz w:val="18"/>
                 <w:szCs w:val="18"/>
               </w:rPr>
@@ -789,20 +919,107 @@
       </w:tr>
     </w:tbl>
     <w:p>
-      <w:pPr>
+      <w:r>
+        <w:br w:type="page"/>
+      </w:r>
+    </w:p>
+    <w:p>
+      <w:pPr>
+        <w:pStyle w:val="Heading1"/>
+        <w:spacing w:after="120"/>
+      </w:pPr>
+      <w:r>
+        <w:rPr>
+          <w:rFonts w:ascii="Prompt" w:cs="Prompt" w:eastAsia="Prompt" w:hAnsi="Prompt"/>
+          <w:b/>
+          <w:bCs/>
+          <w:color w:val="1F3864"/>
+          <w:sz w:val="30"/>
+          <w:szCs w:val="30"/>
+        </w:rPr>
+        <w:t xml:space="preserve">สารบัญ (Contents)</w:t>
+      </w:r>
+    </w:p>
+    <w:sdt>
+      <w:sdtPr>
+        <w:alias w:val="Contents"/>
+      </w:sdtPr>
+      <w:sdtContent>
+        <w:p>
+          <w:r>
+            <w:fldChar w:fldCharType="begin" w:dirty="true"/>
+            <w:instrText xml:space="preserve">TOC \h \o "1-3"</w:instrText>
+            <w:fldChar w:fldCharType="separate"/>
+          </w:r>
+        </w:p>
+        <w:p>
+          <w:r>
+            <w:fldChar w:fldCharType="end"/>
+          </w:r>
+        </w:p>
+      </w:sdtContent>
+    </w:sdt>
+    <w:p>
+      <w:r>
+        <w:br w:type="page"/>
+      </w:r>
+    </w:p>
+    <w:p>
+      <w:pPr>
+        <w:pBdr>
+          <w:left w:val="single" w:color="0C447C" w:sz="18" w:space="10"/>
+        </w:pBdr>
+        <w:shd w:fill="EEF3FA" w:val="clear"/>
         <w:spacing w:after="80"/>
-      </w:pPr>
-      <w:r>
-        <w:t xml:space="preserve"/>
+        <w:ind w:left="360"/>
+      </w:pPr>
+      <w:r>
+        <w:rPr>
+          <w:rFonts w:ascii="Prompt" w:cs="Prompt" w:eastAsia="Prompt" w:hAnsi="Prompt"/>
+          <w:color w:val="33425A"/>
+        </w:rPr>
+        <w:t xml:space="preserve">WS-Sale-App · build v4.2.17 · สำหรับผู้ใช้ทุก Role</w:t>
+      </w:r>
+    </w:p>
+    <w:p>
+      <w:pPr>
+        <w:pBdr>
+          <w:left w:val="single" w:color="0C447C" w:sz="18" w:space="10"/>
+        </w:pBdr>
+        <w:shd w:fill="EEF3FA" w:val="clear"/>
+        <w:spacing w:after="80"/>
+        <w:ind w:left="360"/>
+      </w:pPr>
+      <w:r>
+        <w:rPr>
+          <w:rFonts w:ascii="Prompt" w:cs="Prompt" w:eastAsia="Prompt" w:hAnsi="Prompt"/>
+          <w:color w:val="33425A"/>
+        </w:rPr>
+        <w:t xml:space="preserve">ระบบเป็น Web App (tablet-first, iPad 768–1024px) · เข้าผ่าน browser</w:t>
       </w:r>
     </w:p>
     <w:p>
       <w:pPr>
         <w:pStyle w:val="Heading2"/>
-      </w:pPr>
-      <w:r>
-        <w:rPr>
-          <w:rFonts w:ascii="Prompt" w:cs="Prompt" w:eastAsia="Prompt" w:hAnsi="Prompt"/>
+        <w:spacing w:after="120" w:before="220"/>
+      </w:pPr>
+      <w:r>
+        <w:rPr>
+          <w:rFonts w:ascii="Prompt" w:cs="Prompt" w:eastAsia="Prompt" w:hAnsi="Prompt"/>
+          <w:color w:val="0C447C"/>
+        </w:rPr>
+        <w:t xml:space="preserve">บทบาทผู้ใช้ (Roles)</w:t>
+      </w:r>
+    </w:p>
+    <w:p>
+      <w:pPr>
+        <w:pStyle w:val="Heading2"/>
+        <w:spacing w:after="120" w:before="220"/>
+      </w:pPr>
+      <w:r>
+        <w:rPr>
+          <w:rFonts w:ascii="Prompt" w:cs="Prompt" w:eastAsia="Prompt" w:hAnsi="Prompt"/>
+          <w:color w:val="0C447C"/>
         </w:rPr>
         <w:t xml:space="preserve">การเข้าระบบ</w:t>
       </w:r>
@@ -814,6 +1031,7 @@
           <w:ilvl w:val="0"/>
           <w:numId w:val="2"/>
         </w:numPr>
+        <w:spacing w:after="30"/>
       </w:pPr>
       <w:r>
         <w:rPr>
@@ -837,6 +1055,7 @@
           <w:ilvl w:val="0"/>
           <w:numId w:val="2"/>
         </w:numPr>
+        <w:spacing w:after="30"/>
       </w:pPr>
       <w:r>
         <w:rPr>
@@ -866,6 +1085,7 @@
           <w:ilvl w:val="0"/>
           <w:numId w:val="2"/>
         </w:numPr>
+        <w:spacing w:after="30"/>
       </w:pPr>
       <w:r>
         <w:rPr>
@@ -891,328 +1111,344 @@
     <w:p>
       <w:pPr>
         <w:pBdr>
-          <w:bottom w:val="single" w:color="CCCCCC" w:sz="6" w:space="1"/>
-        </w:pBdr>
-      </w:pPr>
-      <w:r>
-        <w:t xml:space="preserve"/>
-      </w:r>
-    </w:p>
-    <w:p>
-      <w:pPr>
-        <w:pStyle w:val="Heading2"/>
-      </w:pPr>
-      <w:r>
-        <w:rPr>
-          <w:rFonts w:ascii="Prompt" w:cs="Prompt" w:eastAsia="Prompt" w:hAnsi="Prompt"/>
-        </w:rPr>
-        <w:t xml:space="preserve">1. Dashboard — ภาพรวม</w:t>
-      </w:r>
-    </w:p>
-    <w:p>
-      <w:pPr>
-        <w:pStyle w:val="ListParagraph"/>
-        <w:numPr>
-          <w:ilvl w:val="0"/>
-          <w:numId w:val="3"/>
-        </w:numPr>
-      </w:pPr>
-      <w:r>
-        <w:rPr>
-          <w:rFonts w:ascii="Prompt" w:cs="Prompt" w:eastAsia="Prompt" w:hAnsi="Prompt"/>
-        </w:rPr>
-        <w:t xml:space="preserve">เห็น: SO ทั้งหมด, ยืนยัน/รอรับ, ตั๋วคงค้าง &gt;30 วัน, รีเบทใช้ได้ (฿)</w:t>
-      </w:r>
-    </w:p>
-    <w:p>
-      <w:pPr>
-        <w:pStyle w:val="ListParagraph"/>
-        <w:numPr>
-          <w:ilvl w:val="0"/>
-          <w:numId w:val="3"/>
-        </w:numPr>
-      </w:pPr>
-      <w:r>
-        <w:rPr>
-          <w:rFonts w:ascii="Prompt" w:cs="Prompt" w:eastAsia="Prompt" w:hAnsi="Prompt"/>
-        </w:rPr>
-        <w:t xml:space="preserve">ตาราง Aging: สีเหลือง &gt;30 วัน, สีแดง &gt;45 วัน</w:t>
-      </w:r>
-    </w:p>
-    <w:p>
-      <w:pPr>
-        <w:pStyle w:val="ListParagraph"/>
-        <w:numPr>
-          <w:ilvl w:val="0"/>
-          <w:numId w:val="3"/>
-        </w:numPr>
-      </w:pPr>
-      <w:r>
-        <w:rPr>
-          <w:rFonts w:ascii="Prompt" w:cs="Prompt" w:eastAsia="Prompt" w:hAnsi="Prompt"/>
-        </w:rPr>
-        <w:t xml:space="preserve">ใช้ดูสถานะรวมประจำวัน</w:t>
-      </w:r>
-    </w:p>
-    <w:p>
-      <w:pPr>
-        <w:pStyle w:val="Heading2"/>
-      </w:pPr>
-      <w:r>
-        <w:rPr>
-          <w:rFonts w:ascii="Prompt" w:cs="Prompt" w:eastAsia="Prompt" w:hAnsi="Prompt"/>
-        </w:rPr>
-        <w:t xml:space="preserve">2. ขาย / SO (POS) — สร้างใบสั่งขาย</w:t>
-      </w:r>
-    </w:p>
-    <w:p>
-      <w:pPr>
-        <w:spacing w:after="80"/>
-      </w:pPr>
-      <w:r>
-        <w:rPr>
-          <w:rFonts w:ascii="Prompt" w:cs="Prompt" w:eastAsia="Prompt" w:hAnsi="Prompt"/>
-          <w:b/>
-          <w:bCs/>
-        </w:rPr>
-        <w:t xml:space="preserve">ใครใช้:</w:t>
-      </w:r>
-      <w:r>
-        <w:rPr>
-          <w:rFonts w:ascii="Prompt" w:cs="Prompt" w:eastAsia="Prompt" w:hAnsi="Prompt"/>
-        </w:rPr>
-        <w:t xml:space="preserve"> SALES, COUNTER_SALES</w:t>
-      </w:r>
-    </w:p>
-    <w:p>
-      <w:pPr>
-        <w:pStyle w:val="ListParagraph"/>
-        <w:numPr>
-          <w:ilvl w:val="0"/>
-          <w:numId w:val="2"/>
-        </w:numPr>
-      </w:pPr>
-      <w:r>
-        <w:rPr>
-          <w:rFonts w:ascii="Prompt" w:cs="Prompt" w:eastAsia="Prompt" w:hAnsi="Prompt"/>
-        </w:rPr>
-        <w:t xml:space="preserve">เลือก </w:t>
-      </w:r>
-      <w:r>
-        <w:rPr>
-          <w:rFonts w:ascii="Prompt" w:cs="Prompt" w:eastAsia="Prompt" w:hAnsi="Prompt"/>
-          <w:b/>
-          <w:bCs/>
-        </w:rPr>
-        <w:t xml:space="preserve">prefix</w:t>
-      </w:r>
-      <w:r>
-        <w:rPr>
-          <w:rFonts w:ascii="Prompt" w:cs="Prompt" w:eastAsia="Prompt" w:hAnsi="Prompt"/>
-        </w:rPr>
-        <w:t xml:space="preserve"> (I=เชื่อม / K=คลัง / AI=ตั๋วคุม)</w:t>
-      </w:r>
-    </w:p>
-    <w:p>
-      <w:pPr>
-        <w:pStyle w:val="ListParagraph"/>
-        <w:numPr>
-          <w:ilvl w:val="0"/>
-          <w:numId w:val="2"/>
-        </w:numPr>
-      </w:pPr>
-      <w:r>
-        <w:rPr>
-          <w:rFonts w:ascii="Prompt" w:cs="Prompt" w:eastAsia="Prompt" w:hAnsi="Prompt"/>
-        </w:rPr>
-        <w:t xml:space="preserve">ค้นหา/เลือก </w:t>
-      </w:r>
-      <w:r>
-        <w:rPr>
-          <w:rFonts w:ascii="Prompt" w:cs="Prompt" w:eastAsia="Prompt" w:hAnsi="Prompt"/>
-          <w:b/>
-          <w:bCs/>
-        </w:rPr>
-        <w:t xml:space="preserve">ลูกค้า</w:t>
-      </w:r>
-      <w:r>
-        <w:rPr>
-          <w:rFonts w:ascii="Prompt" w:cs="Prompt" w:eastAsia="Prompt" w:hAnsi="Prompt"/>
-        </w:rPr>
-        <w:t xml:space="preserve"> → กรอก </w:t>
-      </w:r>
-      <w:r>
-        <w:rPr>
-          <w:rFonts w:ascii="Prompt" w:cs="Prompt" w:eastAsia="Prompt" w:hAnsi="Prompt"/>
-          <w:b/>
-          <w:bCs/>
-        </w:rPr>
-        <w:t xml:space="preserve">ทะเบียนรถ</w:t>
-      </w:r>
-      <w:r>
-        <w:rPr>
-          <w:rFonts w:ascii="Prompt" w:cs="Prompt" w:eastAsia="Prompt" w:hAnsi="Prompt"/>
-        </w:rPr>
-        <w:t xml:space="preserve">, วันส่ง</w:t>
-      </w:r>
-    </w:p>
-    <w:p>
-      <w:pPr>
-        <w:pStyle w:val="ListParagraph"/>
-        <w:numPr>
-          <w:ilvl w:val="0"/>
-          <w:numId w:val="2"/>
-        </w:numPr>
-      </w:pPr>
-      <w:r>
-        <w:rPr>
-          <w:rFonts w:ascii="Prompt" w:cs="Prompt" w:eastAsia="Prompt" w:hAnsi="Prompt"/>
-        </w:rPr>
-        <w:t xml:space="preserve">แตะการ์ดสินค้าเพื่อ </w:t>
-      </w:r>
-      <w:r>
-        <w:rPr>
-          <w:rFonts w:ascii="Prompt" w:cs="Prompt" w:eastAsia="Prompt" w:hAnsi="Prompt"/>
-          <w:b/>
-          <w:bCs/>
-        </w:rPr>
-        <w:t xml:space="preserve">เพิ่มรายการ</w:t>
-      </w:r>
-      <w:r>
-        <w:rPr>
-          <w:rFonts w:ascii="Prompt" w:cs="Prompt" w:eastAsia="Prompt" w:hAnsi="Prompt"/>
-        </w:rPr>
-        <w:t xml:space="preserve"> → ระบุจำนวน (ตัน)</w:t>
-      </w:r>
-    </w:p>
-    <w:p>
-      <w:pPr>
-        <w:pStyle w:val="ListParagraph"/>
-        <w:numPr>
-          <w:ilvl w:val="0"/>
-          <w:numId w:val="3"/>
-        </w:numPr>
-      </w:pPr>
-      <w:r>
-        <w:rPr>
-          <w:rFonts w:ascii="Prompt" w:cs="Prompt" w:eastAsia="Prompt" w:hAnsi="Prompt"/>
-        </w:rPr>
-        <w:t xml:space="preserve">ระบบแสดง </w:t>
-      </w:r>
-      <w:r>
-        <w:rPr>
-          <w:rFonts w:ascii="Prompt" w:cs="Prompt" w:eastAsia="Prompt" w:hAnsi="Prompt"/>
-          <w:b/>
-          <w:bCs/>
-        </w:rPr>
-        <w:t xml:space="preserve">Reb</w:t>
-      </w:r>
-      <w:r>
-        <w:rPr>
-          <w:rFonts w:ascii="Prompt" w:cs="Prompt" w:eastAsia="Prompt" w:hAnsi="Prompt"/>
-        </w:rPr>
-        <w:t xml:space="preserve"> (รีเบท/ตัน = ราคาขาย − NET) และยอดรวมทันที</w:t>
-      </w:r>
-    </w:p>
-    <w:p>
-      <w:pPr>
-        <w:pStyle w:val="ListParagraph"/>
-        <w:numPr>
-          <w:ilvl w:val="0"/>
-          <w:numId w:val="2"/>
-        </w:numPr>
-      </w:pPr>
-      <w:r>
-        <w:rPr>
-          <w:rFonts w:ascii="Prompt" w:cs="Prompt" w:eastAsia="Prompt" w:hAnsi="Prompt"/>
-        </w:rPr>
-        <w:t xml:space="preserve">(ถ้ามี) เลือก </w:t>
-      </w:r>
-      <w:r>
-        <w:rPr>
-          <w:rFonts w:ascii="Prompt" w:cs="Prompt" w:eastAsia="Prompt" w:hAnsi="Prompt"/>
-          <w:b/>
-          <w:bCs/>
-        </w:rPr>
-        <w:t xml:space="preserve">ของแถม</w:t>
-      </w:r>
-      <w:r>
-        <w:rPr>
-          <w:rFonts w:ascii="Prompt" w:cs="Prompt" w:eastAsia="Prompt" w:hAnsi="Prompt"/>
-        </w:rPr>
-        <w:t xml:space="preserve"> — เห็นงบคงเหลือ</w:t>
-      </w:r>
-    </w:p>
-    <w:p>
-      <w:pPr>
-        <w:pStyle w:val="ListParagraph"/>
-        <w:numPr>
-          <w:ilvl w:val="0"/>
-          <w:numId w:val="2"/>
-        </w:numPr>
-      </w:pPr>
-      <w:r>
-        <w:rPr>
-          <w:rFonts w:ascii="Prompt" w:cs="Prompt" w:eastAsia="Prompt" w:hAnsi="Prompt"/>
-        </w:rPr>
-        <w:t xml:space="preserve">(ถ้ามี) เลือก </w:t>
-      </w:r>
-      <w:r>
-        <w:rPr>
-          <w:rFonts w:ascii="Prompt" w:cs="Prompt" w:eastAsia="Prompt" w:hAnsi="Prompt"/>
-          <w:b/>
-          <w:bCs/>
-        </w:rPr>
-        <w:t xml:space="preserve">ตั๋วคุม</w:t>
-      </w:r>
-      <w:r>
-        <w:rPr>
-          <w:rFonts w:ascii="Prompt" w:cs="Prompt" w:eastAsia="Prompt" w:hAnsi="Prompt"/>
-        </w:rPr>
-        <w:t xml:space="preserve"> เพื่อตัดจากยอดจอง</w:t>
-      </w:r>
-    </w:p>
-    <w:p>
-      <w:pPr>
-        <w:pStyle w:val="ListParagraph"/>
-        <w:numPr>
-          <w:ilvl w:val="0"/>
-          <w:numId w:val="2"/>
-        </w:numPr>
-      </w:pPr>
-      <w:r>
-        <w:rPr>
-          <w:rFonts w:ascii="Prompt" w:cs="Prompt" w:eastAsia="Prompt" w:hAnsi="Prompt"/>
-        </w:rPr>
-        <w:t xml:space="preserve">กด </w:t>
-      </w:r>
-      <w:r>
-        <w:rPr>
-          <w:rFonts w:ascii="Prompt" w:cs="Prompt" w:eastAsia="Prompt" w:hAnsi="Prompt"/>
-          <w:b/>
-          <w:bCs/>
-        </w:rPr>
-        <w:t xml:space="preserve">บันทึก</w:t>
-      </w:r>
-      <w:r>
-        <w:rPr>
-          <w:rFonts w:ascii="Prompt" w:cs="Prompt" w:eastAsia="Prompt" w:hAnsi="Prompt"/>
-        </w:rPr>
-        <w:t xml:space="preserve"> → ได้ SO สถานะ DRAFT</w:t>
-      </w:r>
-    </w:p>
-    <w:p>
-      <w:pPr>
-        <w:pBdr>
-          <w:left w:val="single" w:color="2E75B6" w:sz="12" w:space="8"/>
+          <w:bottom w:val="single" w:color="C9D3E0" w:sz="4" w:space="1"/>
         </w:pBdr>
         <w:spacing w:after="60"/>
+      </w:pPr>
+      <w:r>
+        <w:t xml:space="preserve"/>
+      </w:r>
+    </w:p>
+    <w:p>
+      <w:pPr>
+        <w:pStyle w:val="Heading2"/>
+        <w:spacing w:after="120" w:before="220"/>
+      </w:pPr>
+      <w:r>
+        <w:rPr>
+          <w:rFonts w:ascii="Prompt" w:cs="Prompt" w:eastAsia="Prompt" w:hAnsi="Prompt"/>
+          <w:color w:val="0C447C"/>
+        </w:rPr>
+        <w:t xml:space="preserve">1. Dashboard — ภาพรวม</w:t>
+      </w:r>
+    </w:p>
+    <w:p>
+      <w:pPr>
+        <w:pStyle w:val="ListParagraph"/>
+        <w:numPr>
+          <w:ilvl w:val="0"/>
+          <w:numId w:val="3"/>
+        </w:numPr>
+        <w:spacing w:after="30"/>
+      </w:pPr>
+      <w:r>
+        <w:rPr>
+          <w:rFonts w:ascii="Prompt" w:cs="Prompt" w:eastAsia="Prompt" w:hAnsi="Prompt"/>
+        </w:rPr>
+        <w:t xml:space="preserve">เห็น: SO ทั้งหมด, ยืนยัน/รอรับ, ตั๋วคงค้าง &gt;30 วัน, รีเบทใช้ได้ (฿)</w:t>
+      </w:r>
+    </w:p>
+    <w:p>
+      <w:pPr>
+        <w:pStyle w:val="ListParagraph"/>
+        <w:numPr>
+          <w:ilvl w:val="0"/>
+          <w:numId w:val="3"/>
+        </w:numPr>
+        <w:spacing w:after="30"/>
+      </w:pPr>
+      <w:r>
+        <w:rPr>
+          <w:rFonts w:ascii="Prompt" w:cs="Prompt" w:eastAsia="Prompt" w:hAnsi="Prompt"/>
+        </w:rPr>
+        <w:t xml:space="preserve">ตาราง Aging: สีเหลือง &gt;30 วัน, สีแดง &gt;45 วัน</w:t>
+      </w:r>
+    </w:p>
+    <w:p>
+      <w:pPr>
+        <w:pStyle w:val="ListParagraph"/>
+        <w:numPr>
+          <w:ilvl w:val="0"/>
+          <w:numId w:val="3"/>
+        </w:numPr>
+        <w:spacing w:after="30"/>
+      </w:pPr>
+      <w:r>
+        <w:rPr>
+          <w:rFonts w:ascii="Prompt" w:cs="Prompt" w:eastAsia="Prompt" w:hAnsi="Prompt"/>
+        </w:rPr>
+        <w:t xml:space="preserve">ใช้ดูสถานะรวมประจำวัน</w:t>
+      </w:r>
+    </w:p>
+    <w:p>
+      <w:pPr>
+        <w:pStyle w:val="Heading2"/>
+        <w:spacing w:after="120" w:before="220"/>
+      </w:pPr>
+      <w:r>
+        <w:rPr>
+          <w:rFonts w:ascii="Prompt" w:cs="Prompt" w:eastAsia="Prompt" w:hAnsi="Prompt"/>
+          <w:color w:val="0C447C"/>
+        </w:rPr>
+        <w:t xml:space="preserve">2. ขาย / SO (POS) — สร้างใบสั่งขาย</w:t>
+      </w:r>
+    </w:p>
+    <w:p>
+      <w:pPr>
+        <w:spacing w:after="80" w:line="276"/>
+      </w:pPr>
+      <w:r>
+        <w:rPr>
+          <w:rFonts w:ascii="Prompt" w:cs="Prompt" w:eastAsia="Prompt" w:hAnsi="Prompt"/>
+          <w:b/>
+          <w:bCs/>
+        </w:rPr>
+        <w:t xml:space="preserve">ใครใช้:</w:t>
+      </w:r>
+      <w:r>
+        <w:rPr>
+          <w:rFonts w:ascii="Prompt" w:cs="Prompt" w:eastAsia="Prompt" w:hAnsi="Prompt"/>
+        </w:rPr>
+        <w:t xml:space="preserve"> SALES, COUNTER_SALES</w:t>
+      </w:r>
+    </w:p>
+    <w:p>
+      <w:pPr>
+        <w:pStyle w:val="ListParagraph"/>
+        <w:numPr>
+          <w:ilvl w:val="0"/>
+          <w:numId w:val="2"/>
+        </w:numPr>
+        <w:spacing w:after="30"/>
+      </w:pPr>
+      <w:r>
+        <w:rPr>
+          <w:rFonts w:ascii="Prompt" w:cs="Prompt" w:eastAsia="Prompt" w:hAnsi="Prompt"/>
+        </w:rPr>
+        <w:t xml:space="preserve">เลือก </w:t>
+      </w:r>
+      <w:r>
+        <w:rPr>
+          <w:rFonts w:ascii="Prompt" w:cs="Prompt" w:eastAsia="Prompt" w:hAnsi="Prompt"/>
+          <w:b/>
+          <w:bCs/>
+        </w:rPr>
+        <w:t xml:space="preserve">prefix</w:t>
+      </w:r>
+      <w:r>
+        <w:rPr>
+          <w:rFonts w:ascii="Prompt" w:cs="Prompt" w:eastAsia="Prompt" w:hAnsi="Prompt"/>
+        </w:rPr>
+        <w:t xml:space="preserve"> (I=เชื่อม / K=คลัง / AI=ตั๋วคุม)</w:t>
+      </w:r>
+    </w:p>
+    <w:p>
+      <w:pPr>
+        <w:pStyle w:val="ListParagraph"/>
+        <w:numPr>
+          <w:ilvl w:val="0"/>
+          <w:numId w:val="2"/>
+        </w:numPr>
+        <w:spacing w:after="30"/>
+      </w:pPr>
+      <w:r>
+        <w:rPr>
+          <w:rFonts w:ascii="Prompt" w:cs="Prompt" w:eastAsia="Prompt" w:hAnsi="Prompt"/>
+        </w:rPr>
+        <w:t xml:space="preserve">ค้นหา/เลือก </w:t>
+      </w:r>
+      <w:r>
+        <w:rPr>
+          <w:rFonts w:ascii="Prompt" w:cs="Prompt" w:eastAsia="Prompt" w:hAnsi="Prompt"/>
+          <w:b/>
+          <w:bCs/>
+        </w:rPr>
+        <w:t xml:space="preserve">ลูกค้า</w:t>
+      </w:r>
+      <w:r>
+        <w:rPr>
+          <w:rFonts w:ascii="Prompt" w:cs="Prompt" w:eastAsia="Prompt" w:hAnsi="Prompt"/>
+        </w:rPr>
+        <w:t xml:space="preserve"> → กรอก </w:t>
+      </w:r>
+      <w:r>
+        <w:rPr>
+          <w:rFonts w:ascii="Prompt" w:cs="Prompt" w:eastAsia="Prompt" w:hAnsi="Prompt"/>
+          <w:b/>
+          <w:bCs/>
+        </w:rPr>
+        <w:t xml:space="preserve">ทะเบียนรถ</w:t>
+      </w:r>
+      <w:r>
+        <w:rPr>
+          <w:rFonts w:ascii="Prompt" w:cs="Prompt" w:eastAsia="Prompt" w:hAnsi="Prompt"/>
+        </w:rPr>
+        <w:t xml:space="preserve">, วันส่ง</w:t>
+      </w:r>
+    </w:p>
+    <w:p>
+      <w:pPr>
+        <w:pStyle w:val="ListParagraph"/>
+        <w:numPr>
+          <w:ilvl w:val="0"/>
+          <w:numId w:val="2"/>
+        </w:numPr>
+        <w:spacing w:after="30"/>
+      </w:pPr>
+      <w:r>
+        <w:rPr>
+          <w:rFonts w:ascii="Prompt" w:cs="Prompt" w:eastAsia="Prompt" w:hAnsi="Prompt"/>
+        </w:rPr>
+        <w:t xml:space="preserve">แตะการ์ดสินค้าเพื่อ </w:t>
+      </w:r>
+      <w:r>
+        <w:rPr>
+          <w:rFonts w:ascii="Prompt" w:cs="Prompt" w:eastAsia="Prompt" w:hAnsi="Prompt"/>
+          <w:b/>
+          <w:bCs/>
+        </w:rPr>
+        <w:t xml:space="preserve">เพิ่มรายการ</w:t>
+      </w:r>
+      <w:r>
+        <w:rPr>
+          <w:rFonts w:ascii="Prompt" w:cs="Prompt" w:eastAsia="Prompt" w:hAnsi="Prompt"/>
+        </w:rPr>
+        <w:t xml:space="preserve"> → ระบุจำนวน (ตัน)</w:t>
+      </w:r>
+    </w:p>
+    <w:p>
+      <w:pPr>
+        <w:pStyle w:val="ListParagraph"/>
+        <w:numPr>
+          <w:ilvl w:val="0"/>
+          <w:numId w:val="3"/>
+        </w:numPr>
+        <w:spacing w:after="30"/>
+      </w:pPr>
+      <w:r>
+        <w:rPr>
+          <w:rFonts w:ascii="Prompt" w:cs="Prompt" w:eastAsia="Prompt" w:hAnsi="Prompt"/>
+        </w:rPr>
+        <w:t xml:space="preserve">ระบบแสดง </w:t>
+      </w:r>
+      <w:r>
+        <w:rPr>
+          <w:rFonts w:ascii="Prompt" w:cs="Prompt" w:eastAsia="Prompt" w:hAnsi="Prompt"/>
+          <w:b/>
+          <w:bCs/>
+        </w:rPr>
+        <w:t xml:space="preserve">Reb</w:t>
+      </w:r>
+      <w:r>
+        <w:rPr>
+          <w:rFonts w:ascii="Prompt" w:cs="Prompt" w:eastAsia="Prompt" w:hAnsi="Prompt"/>
+        </w:rPr>
+        <w:t xml:space="preserve"> (รีเบท/ตัน = ราคาขาย − NET) และยอดรวมทันที</w:t>
+      </w:r>
+    </w:p>
+    <w:p>
+      <w:pPr>
+        <w:pStyle w:val="ListParagraph"/>
+        <w:numPr>
+          <w:ilvl w:val="0"/>
+          <w:numId w:val="2"/>
+        </w:numPr>
+        <w:spacing w:after="30"/>
+      </w:pPr>
+      <w:r>
+        <w:rPr>
+          <w:rFonts w:ascii="Prompt" w:cs="Prompt" w:eastAsia="Prompt" w:hAnsi="Prompt"/>
+        </w:rPr>
+        <w:t xml:space="preserve">(ถ้ามี) เลือก </w:t>
+      </w:r>
+      <w:r>
+        <w:rPr>
+          <w:rFonts w:ascii="Prompt" w:cs="Prompt" w:eastAsia="Prompt" w:hAnsi="Prompt"/>
+          <w:b/>
+          <w:bCs/>
+        </w:rPr>
+        <w:t xml:space="preserve">ของแถม</w:t>
+      </w:r>
+      <w:r>
+        <w:rPr>
+          <w:rFonts w:ascii="Prompt" w:cs="Prompt" w:eastAsia="Prompt" w:hAnsi="Prompt"/>
+        </w:rPr>
+        <w:t xml:space="preserve"> — เห็นงบคงเหลือ</w:t>
+      </w:r>
+    </w:p>
+    <w:p>
+      <w:pPr>
+        <w:pStyle w:val="ListParagraph"/>
+        <w:numPr>
+          <w:ilvl w:val="0"/>
+          <w:numId w:val="2"/>
+        </w:numPr>
+        <w:spacing w:after="30"/>
+      </w:pPr>
+      <w:r>
+        <w:rPr>
+          <w:rFonts w:ascii="Prompt" w:cs="Prompt" w:eastAsia="Prompt" w:hAnsi="Prompt"/>
+        </w:rPr>
+        <w:t xml:space="preserve">(ถ้ามี) เลือก </w:t>
+      </w:r>
+      <w:r>
+        <w:rPr>
+          <w:rFonts w:ascii="Prompt" w:cs="Prompt" w:eastAsia="Prompt" w:hAnsi="Prompt"/>
+          <w:b/>
+          <w:bCs/>
+        </w:rPr>
+        <w:t xml:space="preserve">ตั๋วคุม</w:t>
+      </w:r>
+      <w:r>
+        <w:rPr>
+          <w:rFonts w:ascii="Prompt" w:cs="Prompt" w:eastAsia="Prompt" w:hAnsi="Prompt"/>
+        </w:rPr>
+        <w:t xml:space="preserve"> เพื่อตัดจากยอดจอง</w:t>
+      </w:r>
+    </w:p>
+    <w:p>
+      <w:pPr>
+        <w:pStyle w:val="ListParagraph"/>
+        <w:numPr>
+          <w:ilvl w:val="0"/>
+          <w:numId w:val="2"/>
+        </w:numPr>
+        <w:spacing w:after="30"/>
+      </w:pPr>
+      <w:r>
+        <w:rPr>
+          <w:rFonts w:ascii="Prompt" w:cs="Prompt" w:eastAsia="Prompt" w:hAnsi="Prompt"/>
+        </w:rPr>
+        <w:t xml:space="preserve">กด </w:t>
+      </w:r>
+      <w:r>
+        <w:rPr>
+          <w:rFonts w:ascii="Prompt" w:cs="Prompt" w:eastAsia="Prompt" w:hAnsi="Prompt"/>
+          <w:b/>
+          <w:bCs/>
+        </w:rPr>
+        <w:t xml:space="preserve">บันทึก</w:t>
+      </w:r>
+      <w:r>
+        <w:rPr>
+          <w:rFonts w:ascii="Prompt" w:cs="Prompt" w:eastAsia="Prompt" w:hAnsi="Prompt"/>
+        </w:rPr>
+        <w:t xml:space="preserve"> → ได้ SO สถานะ DRAFT</w:t>
+      </w:r>
+    </w:p>
+    <w:p>
+      <w:pPr>
+        <w:pBdr>
+          <w:left w:val="single" w:color="0C447C" w:sz="18" w:space="10"/>
+        </w:pBdr>
+        <w:shd w:fill="EEF3FA" w:val="clear"/>
+        <w:spacing w:after="80"/>
         <w:ind w:left="360"/>
       </w:pPr>
       <w:r>
         <w:rPr>
           <w:rFonts w:ascii="Prompt" w:cs="Prompt" w:eastAsia="Prompt" w:hAnsi="Prompt"/>
-          <w:color w:val="444444"/>
+          <w:color w:val="33425A"/>
         </w:rPr>
         <w:t xml:space="preserve">⚠️ DRAFT ยังต้อง </w:t>
       </w:r>
@@ -1221,14 +1457,14 @@
           <w:rFonts w:ascii="Prompt" w:cs="Prompt" w:eastAsia="Prompt" w:hAnsi="Prompt"/>
           <w:b/>
           <w:bCs/>
-          <w:color w:val="444444"/>
+          <w:color w:val="33425A"/>
         </w:rPr>
         <w:t xml:space="preserve">ตรวจซ้ำ</w:t>
       </w:r>
       <w:r>
         <w:rPr>
           <w:rFonts w:ascii="Prompt" w:cs="Prompt" w:eastAsia="Prompt" w:hAnsi="Prompt"/>
-          <w:color w:val="444444"/>
+          <w:color w:val="33425A"/>
         </w:rPr>
         <w:t xml:space="preserve"> ก่อนยืนยัน (ดูข้อ 5)</w:t>
       </w:r>
@@ -1236,10 +1472,12 @@
     <w:p>
       <w:pPr>
         <w:pStyle w:val="Heading2"/>
-      </w:pPr>
-      <w:r>
-        <w:rPr>
-          <w:rFonts w:ascii="Prompt" w:cs="Prompt" w:eastAsia="Prompt" w:hAnsi="Prompt"/>
+        <w:spacing w:after="120" w:before="220"/>
+      </w:pPr>
+      <w:r>
+        <w:rPr>
+          <w:rFonts w:ascii="Prompt" w:cs="Prompt" w:eastAsia="Prompt" w:hAnsi="Prompt"/>
+          <w:color w:val="0C447C"/>
         </w:rPr>
         <w:t xml:space="preserve">3. เสนอราคา / Quotation</w:t>
       </w:r>
@@ -1251,6 +1489,7 @@
           <w:ilvl w:val="0"/>
           <w:numId w:val="2"/>
         </w:numPr>
+        <w:spacing w:after="30"/>
       </w:pPr>
       <w:r>
         <w:rPr>
@@ -1266,6 +1505,7 @@
           <w:ilvl w:val="0"/>
           <w:numId w:val="2"/>
         </w:numPr>
+        <w:spacing w:after="30"/>
       </w:pPr>
       <w:r>
         <w:rPr>
@@ -1281,6 +1521,7 @@
           <w:ilvl w:val="0"/>
           <w:numId w:val="2"/>
         </w:numPr>
+        <w:spacing w:after="30"/>
       </w:pPr>
       <w:r>
         <w:rPr>
@@ -1300,17 +1541,19 @@
     <w:p>
       <w:pPr>
         <w:pStyle w:val="Heading2"/>
-      </w:pPr>
-      <w:r>
-        <w:rPr>
-          <w:rFonts w:ascii="Prompt" w:cs="Prompt" w:eastAsia="Prompt" w:hAnsi="Prompt"/>
+        <w:spacing w:after="120" w:before="220"/>
+      </w:pPr>
+      <w:r>
+        <w:rPr>
+          <w:rFonts w:ascii="Prompt" w:cs="Prompt" w:eastAsia="Prompt" w:hAnsi="Prompt"/>
+          <w:color w:val="0C447C"/>
         </w:rPr>
         <w:t xml:space="preserve">4. คลัง / Store — รับสินค้า &amp; ชั่งออก</w:t>
       </w:r>
     </w:p>
     <w:p>
       <w:pPr>
-        <w:spacing w:after="80"/>
+        <w:spacing w:after="80" w:line="276"/>
       </w:pPr>
       <w:r>
         <w:rPr>
@@ -1334,6 +1577,7 @@
           <w:ilvl w:val="0"/>
           <w:numId w:val="2"/>
         </w:numPr>
+        <w:spacing w:after="30"/>
       </w:pPr>
       <w:r>
         <w:rPr>
@@ -1357,6 +1601,7 @@
           <w:ilvl w:val="0"/>
           <w:numId w:val="2"/>
         </w:numPr>
+        <w:spacing w:after="30"/>
       </w:pPr>
       <w:r>
         <w:rPr>
@@ -1380,6 +1625,7 @@
           <w:ilvl w:val="0"/>
           <w:numId w:val="2"/>
         </w:numPr>
+        <w:spacing w:after="30"/>
       </w:pPr>
       <w:r>
         <w:rPr>
@@ -1397,6 +1643,7 @@
           <w:ilvl w:val="0"/>
           <w:numId w:val="3"/>
         </w:numPr>
+        <w:spacing w:after="30"/>
       </w:pPr>
       <w:r>
         <w:rPr>
@@ -1462,6 +1709,7 @@
           <w:ilvl w:val="0"/>
           <w:numId w:val="3"/>
         </w:numPr>
+        <w:spacing w:after="30"/>
       </w:pPr>
       <w:r>
         <w:rPr>
@@ -1491,6 +1739,7 @@
           <w:ilvl w:val="0"/>
           <w:numId w:val="3"/>
         </w:numPr>
+        <w:spacing w:after="30"/>
       </w:pPr>
       <w:r>
         <w:rPr>
@@ -1516,17 +1765,19 @@
     <w:p>
       <w:pPr>
         <w:pStyle w:val="Heading2"/>
-      </w:pPr>
-      <w:r>
-        <w:rPr>
-          <w:rFonts w:ascii="Prompt" w:cs="Prompt" w:eastAsia="Prompt" w:hAnsi="Prompt"/>
+        <w:spacing w:after="120" w:before="220"/>
+      </w:pPr>
+      <w:r>
+        <w:rPr>
+          <w:rFonts w:ascii="Prompt" w:cs="Prompt" w:eastAsia="Prompt" w:hAnsi="Prompt"/>
+          <w:color w:val="0C447C"/>
         </w:rPr>
         <w:t xml:space="preserve">5. ตรวจซ้ำ (Verification Gate) — Counter Sales</w:t>
       </w:r>
     </w:p>
     <w:p>
       <w:pPr>
-        <w:spacing w:after="80"/>
+        <w:spacing w:after="80" w:line="276"/>
       </w:pPr>
       <w:r>
         <w:rPr>
@@ -1550,6 +1801,7 @@
           <w:ilvl w:val="0"/>
           <w:numId w:val="3"/>
         </w:numPr>
+        <w:spacing w:after="30"/>
       </w:pPr>
       <w:r>
         <w:rPr>
@@ -1579,6 +1831,7 @@
           <w:ilvl w:val="0"/>
           <w:numId w:val="3"/>
         </w:numPr>
+        <w:spacing w:after="30"/>
       </w:pPr>
       <w:r>
         <w:rPr>
@@ -1608,6 +1861,7 @@
           <w:ilvl w:val="0"/>
           <w:numId w:val="3"/>
         </w:numPr>
+        <w:spacing w:after="30"/>
       </w:pPr>
       <w:r>
         <w:rPr>
@@ -1633,17 +1887,19 @@
     <w:p>
       <w:pPr>
         <w:pStyle w:val="Heading2"/>
-      </w:pPr>
-      <w:r>
-        <w:rPr>
-          <w:rFonts w:ascii="Prompt" w:cs="Prompt" w:eastAsia="Prompt" w:hAnsi="Prompt"/>
+        <w:spacing w:after="120" w:before="220"/>
+      </w:pPr>
+      <w:r>
+        <w:rPr>
+          <w:rFonts w:ascii="Prompt" w:cs="Prompt" w:eastAsia="Prompt" w:hAnsi="Prompt"/>
+          <w:color w:val="0C447C"/>
         </w:rPr>
         <w:t xml:space="preserve">6. Paper Trail — เอกสาร 4 สี + QR</w:t>
       </w:r>
     </w:p>
     <w:p>
       <w:pPr>
-        <w:spacing w:after="80"/>
+        <w:spacing w:after="80" w:line="276"/>
       </w:pPr>
       <w:r>
         <w:rPr>
@@ -1667,6 +1923,7 @@
           <w:ilvl w:val="0"/>
           <w:numId w:val="3"/>
         </w:numPr>
+        <w:spacing w:after="30"/>
       </w:pPr>
       <w:r>
         <w:rPr>
@@ -1690,6 +1947,7 @@
           <w:ilvl w:val="0"/>
           <w:numId w:val="3"/>
         </w:numPr>
+        <w:spacing w:after="30"/>
       </w:pPr>
       <w:r>
         <w:rPr>
@@ -1727,6 +1985,7 @@
           <w:ilvl w:val="0"/>
           <w:numId w:val="3"/>
         </w:numPr>
+        <w:spacing w:after="30"/>
       </w:pPr>
       <w:r>
         <w:rPr>
@@ -1750,6 +2009,7 @@
           <w:ilvl w:val="0"/>
           <w:numId w:val="3"/>
         </w:numPr>
+        <w:spacing w:after="30"/>
       </w:pPr>
       <w:r>
         <w:rPr>
@@ -1773,6 +2033,7 @@
           <w:ilvl w:val="0"/>
           <w:numId w:val="3"/>
         </w:numPr>
+        <w:spacing w:after="30"/>
       </w:pPr>
       <w:r>
         <w:rPr>
@@ -1796,6 +2057,7 @@
           <w:ilvl w:val="0"/>
           <w:numId w:val="3"/>
         </w:numPr>
+        <w:spacing w:after="30"/>
       </w:pPr>
       <w:r>
         <w:rPr>
@@ -1815,17 +2077,19 @@
     <w:p>
       <w:pPr>
         <w:pStyle w:val="Heading2"/>
-      </w:pPr>
-      <w:r>
-        <w:rPr>
-          <w:rFonts w:ascii="Prompt" w:cs="Prompt" w:eastAsia="Prompt" w:hAnsi="Prompt"/>
+        <w:spacing w:after="120" w:before="220"/>
+      </w:pPr>
+      <w:r>
+        <w:rPr>
+          <w:rFonts w:ascii="Prompt" w:cs="Prompt" w:eastAsia="Prompt" w:hAnsi="Prompt"/>
+          <w:color w:val="0C447C"/>
         </w:rPr>
         <w:t xml:space="preserve">7. รีเบท (App) — Pool / FIFO / เคลม</w:t>
       </w:r>
     </w:p>
     <w:p>
       <w:pPr>
-        <w:spacing w:after="80"/>
+        <w:spacing w:after="80" w:line="276"/>
       </w:pPr>
       <w:r>
         <w:rPr>
@@ -1849,6 +2113,7 @@
           <w:ilvl w:val="0"/>
           <w:numId w:val="3"/>
         </w:numPr>
+        <w:spacing w:after="30"/>
       </w:pPr>
       <w:r>
         <w:rPr>
@@ -1878,6 +2143,7 @@
           <w:ilvl w:val="0"/>
           <w:numId w:val="3"/>
         </w:numPr>
+        <w:spacing w:after="30"/>
       </w:pPr>
       <w:r>
         <w:rPr>
@@ -1901,6 +2167,7 @@
           <w:ilvl w:val="0"/>
           <w:numId w:val="3"/>
         </w:numPr>
+        <w:spacing w:after="30"/>
       </w:pPr>
       <w:r>
         <w:rPr>
@@ -1912,17 +2179,19 @@
     <w:p>
       <w:pPr>
         <w:pStyle w:val="Heading2"/>
-      </w:pPr>
-      <w:r>
-        <w:rPr>
-          <w:rFonts w:ascii="Prompt" w:cs="Prompt" w:eastAsia="Prompt" w:hAnsi="Prompt"/>
+        <w:spacing w:after="120" w:before="220"/>
+      </w:pPr>
+      <w:r>
+        <w:rPr>
+          <w:rFonts w:ascii="Prompt" w:cs="Prompt" w:eastAsia="Prompt" w:hAnsi="Prompt"/>
+          <w:color w:val="0C447C"/>
         </w:rPr>
         <w:t xml:space="preserve">8. Rebate Plan — แผนส่งเสริม</w:t>
       </w:r>
     </w:p>
     <w:p>
       <w:pPr>
-        <w:spacing w:after="80"/>
+        <w:spacing w:after="80" w:line="276"/>
       </w:pPr>
       <w:r>
         <w:rPr>
@@ -1946,6 +2215,7 @@
           <w:ilvl w:val="0"/>
           <w:numId w:val="2"/>
         </w:numPr>
+        <w:spacing w:after="30"/>
       </w:pPr>
       <w:r>
         <w:rPr>
@@ -1969,6 +2239,7 @@
           <w:ilvl w:val="0"/>
           <w:numId w:val="2"/>
         </w:numPr>
+        <w:spacing w:after="30"/>
       </w:pPr>
       <w:r>
         <w:rPr>
@@ -1992,6 +2263,7 @@
           <w:ilvl w:val="0"/>
           <w:numId w:val="2"/>
         </w:numPr>
+        <w:spacing w:after="30"/>
       </w:pPr>
       <w:r>
         <w:rPr>
@@ -2015,6 +2287,7 @@
           <w:ilvl w:val="0"/>
           <w:numId w:val="2"/>
         </w:numPr>
+        <w:spacing w:after="30"/>
       </w:pPr>
       <w:r>
         <w:rPr>
@@ -2034,17 +2307,19 @@
     <w:p>
       <w:pPr>
         <w:pStyle w:val="Heading2"/>
-      </w:pPr>
-      <w:r>
-        <w:rPr>
-          <w:rFonts w:ascii="Prompt" w:cs="Prompt" w:eastAsia="Prompt" w:hAnsi="Prompt"/>
+        <w:spacing w:after="120" w:before="220"/>
+      </w:pPr>
+      <w:r>
+        <w:rPr>
+          <w:rFonts w:ascii="Prompt" w:cs="Prompt" w:eastAsia="Prompt" w:hAnsi="Prompt"/>
+          <w:color w:val="0C447C"/>
         </w:rPr>
         <w:t xml:space="preserve">9. CN Rebate — ใบลดหนี้รีเบท (จาก WINSpeed)</w:t>
       </w:r>
     </w:p>
     <w:p>
       <w:pPr>
-        <w:spacing w:after="80"/>
+        <w:spacing w:after="80" w:line="276"/>
       </w:pPr>
       <w:r>
         <w:rPr>
@@ -2068,6 +2343,7 @@
           <w:ilvl w:val="0"/>
           <w:numId w:val="3"/>
         </w:numPr>
+        <w:spacing w:after="30"/>
       </w:pPr>
       <w:r>
         <w:rPr>
@@ -2083,6 +2359,7 @@
           <w:ilvl w:val="0"/>
           <w:numId w:val="3"/>
         </w:numPr>
+        <w:spacing w:after="30"/>
       </w:pPr>
       <w:r>
         <w:rPr>
@@ -2094,10 +2371,12 @@
     <w:p>
       <w:pPr>
         <w:pStyle w:val="Heading2"/>
-      </w:pPr>
-      <w:r>
-        <w:rPr>
-          <w:rFonts w:ascii="Prompt" w:cs="Prompt" w:eastAsia="Prompt" w:hAnsi="Prompt"/>
+        <w:spacing w:after="120" w:before="220"/>
+      </w:pPr>
+      <w:r>
+        <w:rPr>
+          <w:rFonts w:ascii="Prompt" w:cs="Prompt" w:eastAsia="Prompt" w:hAnsi="Prompt"/>
+          <w:color w:val="0C447C"/>
         </w:rPr>
         <w:t xml:space="preserve">10. Voucher — คูปองคงค้าง</w:t>
       </w:r>
@@ -2109,6 +2388,7 @@
           <w:ilvl w:val="0"/>
           <w:numId w:val="3"/>
         </w:numPr>
+        <w:spacing w:after="30"/>
       </w:pPr>
       <w:r>
         <w:rPr>
@@ -2120,17 +2400,19 @@
     <w:p>
       <w:pPr>
         <w:pStyle w:val="Heading2"/>
-      </w:pPr>
-      <w:r>
-        <w:rPr>
-          <w:rFonts w:ascii="Prompt" w:cs="Prompt" w:eastAsia="Prompt" w:hAnsi="Prompt"/>
+        <w:spacing w:after="120" w:before="220"/>
+      </w:pPr>
+      <w:r>
+        <w:rPr>
+          <w:rFonts w:ascii="Prompt" w:cs="Prompt" w:eastAsia="Prompt" w:hAnsi="Prompt"/>
+          <w:color w:val="0C447C"/>
         </w:rPr>
         <w:t xml:space="preserve">11. บัญชี / Accounting</w:t>
       </w:r>
     </w:p>
     <w:p>
       <w:pPr>
-        <w:spacing w:after="80"/>
+        <w:spacing w:after="80" w:line="276"/>
       </w:pPr>
       <w:r>
         <w:rPr>
@@ -2154,6 +2436,7 @@
           <w:ilvl w:val="0"/>
           <w:numId w:val="3"/>
         </w:numPr>
+        <w:spacing w:after="30"/>
       </w:pPr>
       <w:r>
         <w:rPr>
@@ -2177,6 +2460,7 @@
           <w:ilvl w:val="0"/>
           <w:numId w:val="3"/>
         </w:numPr>
+        <w:spacing w:after="30"/>
       </w:pPr>
       <w:r>
         <w:rPr>
@@ -2196,10 +2480,12 @@
     <w:p>
       <w:pPr>
         <w:pStyle w:val="Heading2"/>
-      </w:pPr>
-      <w:r>
-        <w:rPr>
-          <w:rFonts w:ascii="Prompt" w:cs="Prompt" w:eastAsia="Prompt" w:hAnsi="Prompt"/>
+        <w:spacing w:after="120" w:before="220"/>
+      </w:pPr>
+      <w:r>
+        <w:rPr>
+          <w:rFonts w:ascii="Prompt" w:cs="Prompt" w:eastAsia="Prompt" w:hAnsi="Prompt"/>
+          <w:color w:val="0C447C"/>
         </w:rPr>
         <w:t xml:space="preserve">12. ของแถม / Giveaway</w:t>
       </w:r>
@@ -2211,6 +2497,7 @@
           <w:ilvl w:val="0"/>
           <w:numId w:val="3"/>
         </w:numPr>
+        <w:spacing w:after="30"/>
       </w:pPr>
       <w:r>
         <w:rPr>
@@ -2226,6 +2513,7 @@
           <w:ilvl w:val="0"/>
           <w:numId w:val="3"/>
         </w:numPr>
+        <w:spacing w:after="30"/>
       </w:pPr>
       <w:r>
         <w:rPr>
@@ -2245,17 +2533,19 @@
     <w:p>
       <w:pPr>
         <w:pStyle w:val="Heading2"/>
-      </w:pPr>
-      <w:r>
-        <w:rPr>
-          <w:rFonts w:ascii="Prompt" w:cs="Prompt" w:eastAsia="Prompt" w:hAnsi="Prompt"/>
+        <w:spacing w:after="120" w:before="220"/>
+      </w:pPr>
+      <w:r>
+        <w:rPr>
+          <w:rFonts w:ascii="Prompt" w:cs="Prompt" w:eastAsia="Prompt" w:hAnsi="Prompt"/>
+          <w:color w:val="0C447C"/>
         </w:rPr>
         <w:t xml:space="preserve">13. รายงาน / Reports</w:t>
       </w:r>
     </w:p>
     <w:p>
       <w:pPr>
-        <w:spacing w:after="80"/>
+        <w:spacing w:after="80" w:line="276"/>
       </w:pPr>
       <w:r>
         <w:rPr>
@@ -2279,6 +2569,7 @@
           <w:ilvl w:val="0"/>
           <w:numId w:val="3"/>
         </w:numPr>
+        <w:spacing w:after="30"/>
       </w:pPr>
       <w:r>
         <w:rPr>
@@ -2294,6 +2585,7 @@
           <w:ilvl w:val="0"/>
           <w:numId w:val="3"/>
         </w:numPr>
+        <w:spacing w:after="30"/>
       </w:pPr>
       <w:r>
         <w:rPr>
@@ -2319,10 +2611,12 @@
     <w:p>
       <w:pPr>
         <w:pStyle w:val="Heading2"/>
-      </w:pPr>
-      <w:r>
-        <w:rPr>
-          <w:rFonts w:ascii="Prompt" w:cs="Prompt" w:eastAsia="Prompt" w:hAnsi="Prompt"/>
+        <w:spacing w:after="120" w:before="220"/>
+      </w:pPr>
+      <w:r>
+        <w:rPr>
+          <w:rFonts w:ascii="Prompt" w:cs="Prompt" w:eastAsia="Prompt" w:hAnsi="Prompt"/>
+          <w:color w:val="0C447C"/>
         </w:rPr>
         <w:t xml:space="preserve">14. ตั๋วคงค้าง / Aging</w:t>
       </w:r>
@@ -2334,6 +2628,7 @@
           <w:ilvl w:val="0"/>
           <w:numId w:val="3"/>
         </w:numPr>
+        <w:spacing w:after="30"/>
       </w:pPr>
       <w:r>
         <w:rPr>
@@ -2345,10 +2640,12 @@
     <w:p>
       <w:pPr>
         <w:pStyle w:val="Heading2"/>
-      </w:pPr>
-      <w:r>
-        <w:rPr>
-          <w:rFonts w:ascii="Prompt" w:cs="Prompt" w:eastAsia="Prompt" w:hAnsi="Prompt"/>
+        <w:spacing w:after="120" w:before="220"/>
+      </w:pPr>
+      <w:r>
+        <w:rPr>
+          <w:rFonts w:ascii="Prompt" w:cs="Prompt" w:eastAsia="Prompt" w:hAnsi="Prompt"/>
+          <w:color w:val="0C447C"/>
         </w:rPr>
         <w:t xml:space="preserve">15. ชุดตั๋วคุม / Control Ticket</w:t>
       </w:r>
@@ -2360,6 +2657,7 @@
           <w:ilvl w:val="0"/>
           <w:numId w:val="3"/>
         </w:numPr>
+        <w:spacing w:after="30"/>
       </w:pPr>
       <w:r>
         <w:rPr>
@@ -2375,6 +2673,7 @@
           <w:ilvl w:val="0"/>
           <w:numId w:val="3"/>
         </w:numPr>
+        <w:spacing w:after="30"/>
       </w:pPr>
       <w:r>
         <w:rPr>
@@ -2400,17 +2699,19 @@
     <w:p>
       <w:pPr>
         <w:pStyle w:val="Heading2"/>
-      </w:pPr>
-      <w:r>
-        <w:rPr>
-          <w:rFonts w:ascii="Prompt" w:cs="Prompt" w:eastAsia="Prompt" w:hAnsi="Prompt"/>
+        <w:spacing w:after="120" w:before="220"/>
+      </w:pPr>
+      <w:r>
+        <w:rPr>
+          <w:rFonts w:ascii="Prompt" w:cs="Prompt" w:eastAsia="Prompt" w:hAnsi="Prompt"/>
+          <w:color w:val="0C447C"/>
         </w:rPr>
         <w:t xml:space="preserve">16. TruckScale — เครื่องชั่ง</w:t>
       </w:r>
     </w:p>
     <w:p>
       <w:pPr>
-        <w:spacing w:after="80"/>
+        <w:spacing w:after="80" w:line="276"/>
       </w:pPr>
       <w:r>
         <w:rPr>
@@ -2434,6 +2735,7 @@
           <w:ilvl w:val="0"/>
           <w:numId w:val="3"/>
         </w:numPr>
+        <w:spacing w:after="30"/>
       </w:pPr>
       <w:r>
         <w:rPr>
@@ -2449,6 +2751,7 @@
           <w:ilvl w:val="0"/>
           <w:numId w:val="3"/>
         </w:numPr>
+        <w:spacing w:after="30"/>
       </w:pPr>
       <w:r>
         <w:rPr>
@@ -2492,6 +2795,7 @@
           <w:ilvl w:val="0"/>
           <w:numId w:val="3"/>
         </w:numPr>
+        <w:spacing w:after="30"/>
       </w:pPr>
       <w:r>
         <w:rPr>
@@ -2503,10 +2807,12 @@
     <w:p>
       <w:pPr>
         <w:pStyle w:val="Heading2"/>
-      </w:pPr>
-      <w:r>
-        <w:rPr>
-          <w:rFonts w:ascii="Prompt" w:cs="Prompt" w:eastAsia="Prompt" w:hAnsi="Prompt"/>
+        <w:spacing w:after="120" w:before="220"/>
+      </w:pPr>
+      <w:r>
+        <w:rPr>
+          <w:rFonts w:ascii="Prompt" w:cs="Prompt" w:eastAsia="Prompt" w:hAnsi="Prompt"/>
+          <w:color w:val="0C447C"/>
         </w:rPr>
         <w:t xml:space="preserve">17. ผู้ใช้งาน / ข้อมูลหลัก (ADMIN)</w:t>
       </w:r>
@@ -2518,6 +2824,7 @@
           <w:ilvl w:val="0"/>
           <w:numId w:val="3"/>
         </w:numPr>
+        <w:spacing w:after="30"/>
       </w:pPr>
       <w:r>
         <w:rPr>
@@ -2541,6 +2848,7 @@
           <w:ilvl w:val="0"/>
           <w:numId w:val="3"/>
         </w:numPr>
+        <w:spacing w:after="30"/>
       </w:pPr>
       <w:r>
         <w:rPr>
@@ -2574,8 +2882,9 @@
     <w:p>
       <w:pPr>
         <w:pBdr>
-          <w:bottom w:val="single" w:color="CCCCCC" w:sz="6" w:space="1"/>
+          <w:bottom w:val="single" w:color="C9D3E0" w:sz="4" w:space="1"/>
         </w:pBdr>
+        <w:spacing w:after="60"/>
       </w:pPr>
       <w:r>
         <w:t xml:space="preserve"/>
@@ -2584,17 +2893,19 @@
     <w:p>
       <w:pPr>
         <w:pStyle w:val="Heading2"/>
-      </w:pPr>
-      <w:r>
-        <w:rPr>
-          <w:rFonts w:ascii="Prompt" w:cs="Prompt" w:eastAsia="Prompt" w:hAnsi="Prompt"/>
+        <w:spacing w:after="120" w:before="220"/>
+      </w:pPr>
+      <w:r>
+        <w:rPr>
+          <w:rFonts w:ascii="Prompt" w:cs="Prompt" w:eastAsia="Prompt" w:hAnsi="Prompt"/>
+          <w:color w:val="0C447C"/>
         </w:rPr>
         <w:t xml:space="preserve">ปัญหาที่พบบ่อย (Troubleshooting)</w:t>
       </w:r>
     </w:p>
     <w:tbl>
       <w:tblPr>
-        <w:tblW w:type="dxa" w:w="9360"/>
+        <w:tblW w:type="dxa" w:w="9468"/>
         <w:tblBorders>
           <w:top w:val="single" w:color="auto" w:sz="4"/>
           <w:left w:val="single" w:color="auto" w:sz="4"/>
@@ -2605,8 +2916,8 @@
         </w:tblBorders>
       </w:tblPr>
       <w:tblGrid>
-        <w:gridCol w:w="4680"/>
-        <w:gridCol w:w="4680"/>
+        <w:gridCol w:w="4734"/>
+        <w:gridCol w:w="4734"/>
       </w:tblGrid>
       <w:tr>
         <w:trPr>
@@ -2614,7 +2925,7 @@
         </w:trPr>
         <w:tc>
           <w:tcPr>
-            <w:tcW w:type="dxa" w:w="4680"/>
+            <w:tcW w:type="dxa" w:w="4734"/>
             <w:tcBorders>
               <w:top w:val="single" w:color="C9D3E0" w:sz="1"/>
               <w:left w:val="single" w:color="C9D3E0" w:sz="1"/>
@@ -2624,12 +2935,16 @@
             <w:shd w:fill="1F3864" w:val="clear"/>
             <w:tcMar>
               <w:top w:type="dxa" w:w="40"/>
-              <w:left w:type="dxa" w:w="80"/>
+              <w:left w:type="dxa" w:w="90"/>
               <w:bottom w:type="dxa" w:w="40"/>
-              <w:right w:type="dxa" w:w="80"/>
+              <w:right w:type="dxa" w:w="90"/>
             </w:tcMar>
+            <w:vAlign w:val="center"/>
           </w:tcPr>
           <w:p>
+            <w:pPr>
+              <w:spacing w:after="0" w:line="252"/>
+            </w:pPr>
             <w:r>
               <w:rPr>
                 <w:rFonts w:ascii="Prompt" w:cs="Prompt" w:eastAsia="Prompt" w:hAnsi="Prompt"/>
@@ -2645,7 +2960,7 @@
         </w:tc>
         <w:tc>
           <w:tcPr>
-            <w:tcW w:type="dxa" w:w="4680"/>
+            <w:tcW w:type="dxa" w:w="4734"/>
             <w:tcBorders>
               <w:top w:val="single" w:color="C9D3E0" w:sz="1"/>
               <w:left w:val="single" w:color="C9D3E0" w:sz="1"/>
@@ -2655,12 +2970,16 @@
             <w:shd w:fill="1F3864" w:val="clear"/>
             <w:tcMar>
               <w:top w:type="dxa" w:w="40"/>
-              <w:left w:type="dxa" w:w="80"/>
+              <w:left w:type="dxa" w:w="90"/>
               <w:bottom w:type="dxa" w:w="40"/>
-              <w:right w:type="dxa" w:w="80"/>
+              <w:right w:type="dxa" w:w="90"/>
             </w:tcMar>
+            <w:vAlign w:val="center"/>
           </w:tcPr>
           <w:p>
+            <w:pPr>
+              <w:spacing w:after="0" w:line="252"/>
+            </w:pPr>
             <w:r>
               <w:rPr>
                 <w:rFonts w:ascii="Prompt" w:cs="Prompt" w:eastAsia="Prompt" w:hAnsi="Prompt"/>
@@ -2678,7 +2997,7 @@
       <w:tr>
         <w:tc>
           <w:tcPr>
-            <w:tcW w:type="dxa" w:w="4680"/>
+            <w:tcW w:type="dxa" w:w="4734"/>
             <w:tcBorders>
               <w:top w:val="single" w:color="C9D3E0" w:sz="1"/>
               <w:left w:val="single" w:color="C9D3E0" w:sz="1"/>
@@ -2688,15 +3007,20 @@
             <w:shd w:fill="FFFFFF" w:val="clear"/>
             <w:tcMar>
               <w:top w:type="dxa" w:w="40"/>
-              <w:left w:type="dxa" w:w="80"/>
+              <w:left w:type="dxa" w:w="90"/>
               <w:bottom w:type="dxa" w:w="40"/>
-              <w:right w:type="dxa" w:w="80"/>
+              <w:right w:type="dxa" w:w="90"/>
             </w:tcMar>
+            <w:vAlign w:val="center"/>
           </w:tcPr>
           <w:p>
+            <w:pPr>
+              <w:spacing w:after="0" w:line="252"/>
+            </w:pPr>
             <w:r>
               <w:rPr>
                 <w:rFonts w:ascii="Prompt" w:cs="Prompt" w:eastAsia="Prompt" w:hAnsi="Prompt"/>
+                <w:color w:val="1A1A1A"/>
                 <w:sz w:val="18"/>
                 <w:szCs w:val="18"/>
               </w:rPr>
@@ -2706,7 +3030,7 @@
         </w:tc>
         <w:tc>
           <w:tcPr>
-            <w:tcW w:type="dxa" w:w="4680"/>
+            <w:tcW w:type="dxa" w:w="4734"/>
             <w:tcBorders>
               <w:top w:val="single" w:color="C9D3E0" w:sz="1"/>
               <w:left w:val="single" w:color="C9D3E0" w:sz="1"/>
@@ -2716,15 +3040,20 @@
             <w:shd w:fill="FFFFFF" w:val="clear"/>
             <w:tcMar>
               <w:top w:type="dxa" w:w="40"/>
-              <w:left w:type="dxa" w:w="80"/>
+              <w:left w:type="dxa" w:w="90"/>
               <w:bottom w:type="dxa" w:w="40"/>
-              <w:right w:type="dxa" w:w="80"/>
+              <w:right w:type="dxa" w:w="90"/>
             </w:tcMar>
+            <w:vAlign w:val="center"/>
           </w:tcPr>
           <w:p>
+            <w:pPr>
+              <w:spacing w:after="0" w:line="252"/>
+            </w:pPr>
             <w:r>
               <w:rPr>
                 <w:rFonts w:ascii="Prompt" w:cs="Prompt" w:eastAsia="Prompt" w:hAnsi="Prompt"/>
+                <w:color w:val="1A1A1A"/>
                 <w:sz w:val="18"/>
                 <w:szCs w:val="18"/>
               </w:rPr>
@@ -2736,25 +3065,30 @@
       <w:tr>
         <w:tc>
           <w:tcPr>
-            <w:tcW w:type="dxa" w:w="4680"/>
+            <w:tcW w:type="dxa" w:w="4734"/>
             <w:tcBorders>
               <w:top w:val="single" w:color="C9D3E0" w:sz="1"/>
               <w:left w:val="single" w:color="C9D3E0" w:sz="1"/>
               <w:bottom w:val="single" w:color="C9D3E0" w:sz="1"/>
               <w:right w:val="single" w:color="C9D3E0" w:sz="1"/>
             </w:tcBorders>
-            <w:shd w:fill="FFFFFF" w:val="clear"/>
+            <w:shd w:fill="F4F6FA" w:val="clear"/>
             <w:tcMar>
               <w:top w:type="dxa" w:w="40"/>
-              <w:left w:type="dxa" w:w="80"/>
+              <w:left w:type="dxa" w:w="90"/>
               <w:bottom w:type="dxa" w:w="40"/>
-              <w:right w:type="dxa" w:w="80"/>
+              <w:right w:type="dxa" w:w="90"/>
             </w:tcMar>
+            <w:vAlign w:val="center"/>
           </w:tcPr>
           <w:p>
+            <w:pPr>
+              <w:spacing w:after="0" w:line="252"/>
+            </w:pPr>
             <w:r>
               <w:rPr>
                 <w:rFonts w:ascii="Prompt" w:cs="Prompt" w:eastAsia="Prompt" w:hAnsi="Prompt"/>
+                <w:color w:val="1A1A1A"/>
                 <w:sz w:val="18"/>
                 <w:szCs w:val="18"/>
               </w:rPr>
@@ -2764,25 +3098,30 @@
         </w:tc>
         <w:tc>
           <w:tcPr>
-            <w:tcW w:type="dxa" w:w="4680"/>
+            <w:tcW w:type="dxa" w:w="4734"/>
             <w:tcBorders>
               <w:top w:val="single" w:color="C9D3E0" w:sz="1"/>
               <w:left w:val="single" w:color="C9D3E0" w:sz="1"/>
               <w:bottom w:val="single" w:color="C9D3E0" w:sz="1"/>
               <w:right w:val="single" w:color="C9D3E0" w:sz="1"/>
             </w:tcBorders>
-            <w:shd w:fill="FFFFFF" w:val="clear"/>
+            <w:shd w:fill="F4F6FA" w:val="clear"/>
             <w:tcMar>
               <w:top w:type="dxa" w:w="40"/>
-              <w:left w:type="dxa" w:w="80"/>
+              <w:left w:type="dxa" w:w="90"/>
               <w:bottom w:type="dxa" w:w="40"/>
-              <w:right w:type="dxa" w:w="80"/>
+              <w:right w:type="dxa" w:w="90"/>
             </w:tcMar>
+            <w:vAlign w:val="center"/>
           </w:tcPr>
           <w:p>
+            <w:pPr>
+              <w:spacing w:after="0" w:line="252"/>
+            </w:pPr>
             <w:r>
               <w:rPr>
                 <w:rFonts w:ascii="Prompt" w:cs="Prompt" w:eastAsia="Prompt" w:hAnsi="Prompt"/>
+                <w:color w:val="1A1A1A"/>
                 <w:sz w:val="18"/>
                 <w:szCs w:val="18"/>
               </w:rPr>
@@ -2794,7 +3133,7 @@
       <w:tr>
         <w:tc>
           <w:tcPr>
-            <w:tcW w:type="dxa" w:w="4680"/>
+            <w:tcW w:type="dxa" w:w="4734"/>
             <w:tcBorders>
               <w:top w:val="single" w:color="C9D3E0" w:sz="1"/>
               <w:left w:val="single" w:color="C9D3E0" w:sz="1"/>
@@ -2804,15 +3143,20 @@
             <w:shd w:fill="FFFFFF" w:val="clear"/>
             <w:tcMar>
               <w:top w:type="dxa" w:w="40"/>
-              <w:left w:type="dxa" w:w="80"/>
+              <w:left w:type="dxa" w:w="90"/>
               <w:bottom w:type="dxa" w:w="40"/>
-              <w:right w:type="dxa" w:w="80"/>
+              <w:right w:type="dxa" w:w="90"/>
             </w:tcMar>
+            <w:vAlign w:val="center"/>
           </w:tcPr>
           <w:p>
+            <w:pPr>
+              <w:spacing w:after="0" w:line="252"/>
+            </w:pPr>
             <w:r>
               <w:rPr>
                 <w:rFonts w:ascii="Prompt" w:cs="Prompt" w:eastAsia="Prompt" w:hAnsi="Prompt"/>
+                <w:color w:val="1A1A1A"/>
                 <w:sz w:val="18"/>
                 <w:szCs w:val="18"/>
               </w:rPr>
@@ -2822,7 +3166,7 @@
         </w:tc>
         <w:tc>
           <w:tcPr>
-            <w:tcW w:type="dxa" w:w="4680"/>
+            <w:tcW w:type="dxa" w:w="4734"/>
             <w:tcBorders>
               <w:top w:val="single" w:color="C9D3E0" w:sz="1"/>
               <w:left w:val="single" w:color="C9D3E0" w:sz="1"/>
@@ -2832,15 +3176,20 @@
             <w:shd w:fill="FFFFFF" w:val="clear"/>
             <w:tcMar>
               <w:top w:type="dxa" w:w="40"/>
-              <w:left w:type="dxa" w:w="80"/>
+              <w:left w:type="dxa" w:w="90"/>
               <w:bottom w:type="dxa" w:w="40"/>
-              <w:right w:type="dxa" w:w="80"/>
+              <w:right w:type="dxa" w:w="90"/>
             </w:tcMar>
+            <w:vAlign w:val="center"/>
           </w:tcPr>
           <w:p>
+            <w:pPr>
+              <w:spacing w:after="0" w:line="252"/>
+            </w:pPr>
             <w:r>
               <w:rPr>
                 <w:rFonts w:ascii="Prompt" w:cs="Prompt" w:eastAsia="Prompt" w:hAnsi="Prompt"/>
+                <w:color w:val="1A1A1A"/>
                 <w:sz w:val="18"/>
                 <w:szCs w:val="18"/>
               </w:rPr>
@@ -2852,25 +3201,30 @@
       <w:tr>
         <w:tc>
           <w:tcPr>
-            <w:tcW w:type="dxa" w:w="4680"/>
+            <w:tcW w:type="dxa" w:w="4734"/>
             <w:tcBorders>
               <w:top w:val="single" w:color="C9D3E0" w:sz="1"/>
               <w:left w:val="single" w:color="C9D3E0" w:sz="1"/>
               <w:bottom w:val="single" w:color="C9D3E0" w:sz="1"/>
               <w:right w:val="single" w:color="C9D3E0" w:sz="1"/>
             </w:tcBorders>
-            <w:shd w:fill="FFFFFF" w:val="clear"/>
+            <w:shd w:fill="F4F6FA" w:val="clear"/>
             <w:tcMar>
               <w:top w:type="dxa" w:w="40"/>
-              <w:left w:type="dxa" w:w="80"/>
+              <w:left w:type="dxa" w:w="90"/>
               <w:bottom w:type="dxa" w:w="40"/>
-              <w:right w:type="dxa" w:w="80"/>
+              <w:right w:type="dxa" w:w="90"/>
             </w:tcMar>
+            <w:vAlign w:val="center"/>
           </w:tcPr>
           <w:p>
+            <w:pPr>
+              <w:spacing w:after="0" w:line="252"/>
+            </w:pPr>
             <w:r>
               <w:rPr>
                 <w:rFonts w:ascii="Prompt" w:cs="Prompt" w:eastAsia="Prompt" w:hAnsi="Prompt"/>
+                <w:color w:val="1A1A1A"/>
                 <w:sz w:val="18"/>
                 <w:szCs w:val="18"/>
               </w:rPr>
@@ -2880,25 +3234,30 @@
         </w:tc>
         <w:tc>
           <w:tcPr>
-            <w:tcW w:type="dxa" w:w="4680"/>
+            <w:tcW w:type="dxa" w:w="4734"/>
             <w:tcBorders>
               <w:top w:val="single" w:color="C9D3E0" w:sz="1"/>
               <w:left w:val="single" w:color="C9D3E0" w:sz="1"/>
               <w:bottom w:val="single" w:color="C9D3E0" w:sz="1"/>
               <w:right w:val="single" w:color="C9D3E0" w:sz="1"/>
             </w:tcBorders>
-            <w:shd w:fill="FFFFFF" w:val="clear"/>
+            <w:shd w:fill="F4F6FA" w:val="clear"/>
             <w:tcMar>
               <w:top w:type="dxa" w:w="40"/>
-              <w:left w:type="dxa" w:w="80"/>
+              <w:left w:type="dxa" w:w="90"/>
               <w:bottom w:type="dxa" w:w="40"/>
-              <w:right w:type="dxa" w:w="80"/>
+              <w:right w:type="dxa" w:w="90"/>
             </w:tcMar>
+            <w:vAlign w:val="center"/>
           </w:tcPr>
           <w:p>
+            <w:pPr>
+              <w:spacing w:after="0" w:line="252"/>
+            </w:pPr>
             <w:r>
               <w:rPr>
                 <w:rFonts w:ascii="Prompt" w:cs="Prompt" w:eastAsia="Prompt" w:hAnsi="Prompt"/>
+                <w:color w:val="1A1A1A"/>
                 <w:sz w:val="18"/>
                 <w:szCs w:val="18"/>
               </w:rPr>
@@ -2910,15 +3269,17 @@
     </w:tbl>
     <w:p>
       <w:pPr>
-        <w:spacing w:after="80"/>
+        <w:spacing w:after="100"/>
       </w:pPr>
       <w:r>
         <w:t xml:space="preserve"/>
       </w:r>
     </w:p>
     <w:sectPr>
-      <w:pgSz w:w="12240" w:h="15840" w:orient="portrait"/>
-      <w:pgMar w:top="1440" w:right="1080" w:bottom="1440" w:left="1080" w:header="708" w:footer="708" w:gutter="0"/>
+      <w:headerReference w:type="default" r:id="rId7"/>
+      <w:footerReference w:type="default" r:id="rId8"/>
+      <w:pgSz w:w="11906" w:h="16838" w:orient="portrait"/>
+      <w:pgMar w:top="1200" w:right="1080" w:bottom="1200" w:left="1080" w:header="708" w:footer="708" w:gutter="0"/>
       <w:pgNumType/>
       <w:docGrid w:linePitch="360"/>
     </w:sectPr>
@@ -2967,6 +3328,46 @@
 </w:endnotes>
 </file>
 
+<file path=word/footer1.xml><?xml version="1.0" encoding="utf-8"?>
+<w:ftr xmlns:wpc="http://schemas.microsoft.com/office/word/2010/wordprocessingCanvas" xmlns:mc="http://schemas.openxmlformats.org/markup-compatibility/2006" xmlns:o="urn:schemas-microsoft-com:office:office" xmlns:r="http://schemas.openxmlformats.org/officeDocument/2006/relationships" xmlns:m="http://schemas.openxmlformats.org/officeDocument/2006/math" xmlns:v="urn:schemas-microsoft-com:vml" xmlns:wp14="http://schemas.microsoft.com/office/word/2010/wordprocessingDrawing" xmlns:wp="http://schemas.openxmlformats.org/drawingml/2006/wordprocessingDrawing" xmlns:w10="urn:schemas-microsoft-com:office:word" xmlns:w="http://schemas.openxmlformats.org/wordprocessingml/2006/main" xmlns:w14="http://schemas.microsoft.com/office/word/2010/wordml" xmlns:w15="http://schemas.microsoft.com/office/word/2012/wordml" xmlns:wpg="http://schemas.microsoft.com/office/word/2010/wordprocessingGroup" xmlns:wpi="http://schemas.microsoft.com/office/word/2010/wordprocessingInk" xmlns:wne="http://schemas.microsoft.com/office/word/2006/wordml" xmlns:wps="http://schemas.microsoft.com/office/word/2010/wordprocessingShape">
+  <w:p>
+    <w:pPr>
+      <w:pBdr>
+        <w:top w:val="single" w:color="C9D3E0" w:sz="4" w:space="4"/>
+      </w:pBdr>
+      <w:jc w:val="center"/>
+    </w:pPr>
+    <w:r>
+      <w:rPr>
+        <w:rFonts w:ascii="Prompt" w:cs="Prompt" w:eastAsia="Prompt" w:hAnsi="Prompt"/>
+        <w:color w:val="999999"/>
+        <w:sz w:val="14"/>
+        <w:szCs w:val="14"/>
+      </w:rPr>
+      <w:t xml:space="preserve">WS-Sale-App · v7.0 · </w:t>
+    </w:r>
+    <w:r>
+      <w:rPr>
+        <w:rFonts w:ascii="Prompt" w:cs="Prompt" w:eastAsia="Prompt" w:hAnsi="Prompt"/>
+        <w:color w:val="999999"/>
+        <w:sz w:val="14"/>
+        <w:szCs w:val="14"/>
+      </w:rPr>
+      <w:t xml:space="preserve">หน้า </w:t>
+      <w:fldChar w:fldCharType="begin"/>
+      <w:instrText xml:space="preserve">PAGE</w:instrText>
+      <w:fldChar w:fldCharType="separate"/>
+      <w:fldChar w:fldCharType="end"/>
+      <w:t xml:space="preserve"> / </w:t>
+      <w:fldChar w:fldCharType="begin"/>
+      <w:instrText xml:space="preserve">NUMPAGES</w:instrText>
+      <w:fldChar w:fldCharType="separate"/>
+      <w:fldChar w:fldCharType="end"/>
+    </w:r>
+  </w:p>
+</w:ftr>
+</file>
+
 <file path=word/footnotes.xml><?xml version="1.0" encoding="utf-8"?>
 <w:footnotes xmlns:wpc="http://schemas.microsoft.com/office/word/2010/wordprocessingCanvas" xmlns:mc="http://schemas.openxmlformats.org/markup-compatibility/2006" xmlns:o="urn:schemas-microsoft-com:office:office" xmlns:r="http://schemas.openxmlformats.org/officeDocument/2006/relationships" xmlns:m="http://schemas.openxmlformats.org/officeDocument/2006/math" xmlns:v="urn:schemas-microsoft-com:vml" xmlns:wp14="http://schemas.microsoft.com/office/word/2010/wordprocessingDrawing" xmlns:wp="http://schemas.openxmlformats.org/drawingml/2006/wordprocessingDrawing" xmlns:w10="urn:schemas-microsoft-com:office:word" xmlns:w="http://schemas.openxmlformats.org/wordprocessingml/2006/main" xmlns:w14="http://schemas.microsoft.com/office/word/2010/wordml" xmlns:w15="http://schemas.microsoft.com/office/word/2012/wordml" xmlns:wpg="http://schemas.microsoft.com/office/word/2010/wordprocessingGroup" xmlns:wpi="http://schemas.microsoft.com/office/word/2010/wordprocessingInk" xmlns:wne="http://schemas.microsoft.com/office/word/2006/wordml" xmlns:wps="http://schemas.microsoft.com/office/word/2010/wordprocessingShape" mc:Ignorable="w14 w15 wp14">
   <w:footnote w:type="separator" w:id="-1">
@@ -3002,6 +3403,39 @@
     </w:p>
   </w:footnote>
 </w:footnotes>
+</file>
+
+<file path=word/header1.xml><?xml version="1.0" encoding="utf-8"?>
+<w:hdr xmlns:wpc="http://schemas.microsoft.com/office/word/2010/wordprocessingCanvas" xmlns:mc="http://schemas.openxmlformats.org/markup-compatibility/2006" xmlns:o="urn:schemas-microsoft-com:office:office" xmlns:r="http://schemas.openxmlformats.org/officeDocument/2006/relationships" xmlns:m="http://schemas.openxmlformats.org/officeDocument/2006/math" xmlns:v="urn:schemas-microsoft-com:vml" xmlns:wp14="http://schemas.microsoft.com/office/word/2010/wordprocessingDrawing" xmlns:wp="http://schemas.openxmlformats.org/drawingml/2006/wordprocessingDrawing" xmlns:w10="urn:schemas-microsoft-com:office:word" xmlns:w="http://schemas.openxmlformats.org/wordprocessingml/2006/main" xmlns:w14="http://schemas.microsoft.com/office/word/2010/wordml" xmlns:w15="http://schemas.microsoft.com/office/word/2012/wordml" xmlns:wpg="http://schemas.microsoft.com/office/word/2010/wordprocessingGroup" xmlns:wpi="http://schemas.microsoft.com/office/word/2010/wordprocessingInk" xmlns:wne="http://schemas.microsoft.com/office/word/2006/wordml" xmlns:wps="http://schemas.microsoft.com/office/word/2010/wordprocessingShape" xmlns:cx="http://schemas.microsoft.com/office/drawing/2014/chartex" xmlns:cx1="http://schemas.microsoft.com/office/drawing/2015/9/8/chartex" xmlns:cx2="http://schemas.microsoft.com/office/drawing/2015/10/21/chartex" xmlns:cx3="http://schemas.microsoft.com/office/drawing/2016/5/9/chartex" xmlns:cx4="http://schemas.microsoft.com/office/drawing/2016/5/10/chartex" xmlns:cx5="http://schemas.microsoft.com/office/drawing/2016/5/11/chartex" xmlns:cx6="http://schemas.microsoft.com/office/drawing/2016/5/12/chartex" xmlns:cx7="http://schemas.microsoft.com/office/drawing/2016/5/13/chartex" xmlns:cx8="http://schemas.microsoft.com/office/drawing/2016/5/14/chartex" xmlns:w16cid="http://schemas.microsoft.com/office/word/2016/wordml/cid" xmlns:w16se="http://schemas.microsoft.com/office/word/2015/wordml/symex">
+  <w:p>
+    <w:pPr>
+      <w:pBdr>
+        <w:bottom w:val="single" w:color="0C447C" w:sz="4" w:space="4"/>
+      </w:pBdr>
+      <w:tabs>
+        <w:tab w:val="right" w:pos="9026"/>
+      </w:tabs>
+    </w:pPr>
+    <w:r>
+      <w:rPr>
+        <w:rFonts w:ascii="Prompt" w:cs="Prompt" w:eastAsia="Prompt" w:hAnsi="Prompt"/>
+        <w:color w:val="0C447C"/>
+        <w:sz w:val="14"/>
+        <w:szCs w:val="14"/>
+      </w:rPr>
+      <w:t xml:space="preserve">03 — คู่มือผู้ใช้งาน (User Guide &amp; Manual)</w:t>
+    </w:r>
+    <w:r>
+      <w:rPr>
+        <w:rFonts w:ascii="Prompt" w:cs="Prompt" w:eastAsia="Prompt" w:hAnsi="Prompt"/>
+        <w:color w:val="999999"/>
+        <w:sz w:val="14"/>
+        <w:szCs w:val="14"/>
+      </w:rPr>
+      <w:t xml:space="preserve">	World Fert · Confidential</w:t>
+    </w:r>
+  </w:p>
+</w:hdr>
 </file>
 
 <file path=word/numbering.xml><?xml version="1.0" encoding="utf-8"?>
@@ -3100,6 +3534,9 @@
       <w:pPr>
         <w:ind w:left="540" w:hanging="260"/>
       </w:pPr>
+      <w:rPr>
+        <w:color w:val="0C447C"/>
+      </w:rPr>
     </w:lvl>
   </w:abstractNum>
   <w:abstractNum w:abstractNumId="3" w15:restartNumberingAfterBreak="0">
@@ -3141,6 +3578,7 @@
     <w:rPrDefault>
       <w:rPr>
         <w:rFonts w:ascii="Prompt" w:cs="Prompt" w:eastAsia="Prompt" w:hAnsi="Prompt"/>
+        <w:color w:val="1A1A1A"/>
         <w:sz w:val="20"/>
         <w:szCs w:val="20"/>
       </w:rPr>

</xml_diff>